<commit_message>
docs: enrich ERP resolution with 25 modules, custom architecture, and tech stack
</commit_message>
<xml_diff>
--- a/docs/GHSS_Shangus_Institutional_ERP_Resolution.docx
+++ b/docs/GHSS_Shangus_Institutional_ERP_Resolution.docx
@@ -260,7 +260,7 @@
                 <w:szCs w:val="21"/>
                 <w:rFonts w:ascii="Calibri" w:cs="Calibri" w:eastAsia="Calibri" w:hAnsi="Calibri"/>
               </w:rPr>
-              <w:t xml:space="preserve">A formal administrative decree and statutory institutional resolution passed in an extraordinary council meeting chaired by the Principal, GHSS Shangus, with senior faculty members, lecturers, masters, academic conveners, and administrative in-charges. This resolution officially evaluates the capabilities, problems resolved, and whole-school transformative impacts of the custom-engineered GHSS Shangus School Enterprise Resource Planning (ERP) Platform (comprising 210,261 lines of custom code, 4 autonomous portals, and 22 integrated office tools). The council formally approves, sanctions, and adopts the ERP system as the permanent, official, sovereign digital governance infrastructure of Govt. Higher Secondary School Shangus, establishing operational protocols, committee portfolios, data verification mandates, and authorizing public deployment.</w:t>
+              <w:t xml:space="preserve">A formal administrative decree and statutory institutional resolution passed in an extraordinary council meeting chaired by the Principal, GHSS Shangus, with senior faculty members, lecturers, masters, academic conveners, and administrative in-charges. This resolution officially evaluates the capabilities, problems resolved, and whole-school transformative impacts of the custom-engineered GHSS Shangus School Enterprise Resource Planning (ERP) Platform (comprising 210,261 lines of custom code, 4 autonomous portals, and 25 integrated enterprise modules across 4 functional divisions). The council formally approves, sanctions, and adopts the ERP system as the permanent, official, sovereign digital governance infrastructure of Govt. Higher Secondary School Shangus, establishing operational protocols, committee portfolios, data verification mandates, and authorizing public deployment.</w:t>
             </w:r>
           </w:p>
         </w:tc>
@@ -2633,7 +2633,7 @@
                 <w:szCs w:val="19"/>
                 <w:rFonts w:ascii="Calibri" w:cs="Calibri" w:eastAsia="Calibri" w:hAnsi="Calibri"/>
               </w:rPr>
-              <w:t xml:space="preserve">Suite of 22 integrated automated tools (Class Roll Number Generator, Roster Builder, ID Card Studio, Letterhead Writer, Batch Field Overwriter) executing complex tasks in seconds.</w:t>
+              <w:t xml:space="preserve">Suite of 25 integrated enterprise modules (Class Roll Number Generator, Roster Builder, ID Card Studio, Letterhead Writer, Batch Field Overwriter) executing complex tasks in seconds.</w:t>
             </w:r>
           </w:p>
         </w:tc>
@@ -2882,7 +2882,7 @@
           <w:szCs w:val="22"/>
           <w:rFonts w:ascii="Calibri" w:cs="Calibri" w:eastAsia="Calibri" w:hAnsi="Calibri"/>
         </w:rPr>
-        <w:t xml:space="preserve">WHEREAS, the faculty and administration have thoroughly tested, verified, and audited the custom-engineered institutional ERP platform comprising 210,261 lines of custom source code across 322 files, 4 autonomous portals, and 22 integrated office tools, finding it fully compliant with JKBOSE curriculum norms, financial reporting regulations, and student privacy requirements;</w:t>
+        <w:t xml:space="preserve">WHEREAS, the faculty and administration have thoroughly tested, verified, and audited the custom-engineered institutional ERP platform comprising 210,261 lines of custom source code across 322 files, 4 autonomous portals, and 25 integrated enterprise modules, finding it fully compliant with JKBOSE curriculum norms, financial reporting regulations, and student privacy requirements;</w:t>
       </w:r>
     </w:p>
     <w:p>
@@ -3744,7 +3744,7 @@
           <w:szCs w:val="26"/>
           <w:rFonts w:ascii="Calibri" w:cs="Calibri" w:eastAsia="Calibri" w:hAnsi="Calibri"/>
         </w:rPr>
-        <w:t xml:space="preserve">5. Schedule A: Enterprise Architecture &amp; 22 Integrated School Office Tools</w:t>
+        <w:t xml:space="preserve">5. Schedule A: Enterprise Architecture &amp; 25 Integrated School Office Modules</w:t>
       </w:r>
     </w:p>
     <w:p>
@@ -3760,7 +3760,7 @@
           <w:szCs w:val="20"/>
           <w:rFonts w:ascii="Calibri" w:cs="Calibri" w:eastAsia="Calibri" w:hAnsi="Calibri"/>
         </w:rPr>
-        <w:t xml:space="preserve">Statutory allocation of operational modules, capabilities, and designated custodians.</w:t>
+        <w:t xml:space="preserve">Statutory allocation of operational modules across 4 functional divisions, capabilities, and designated custodians.</w:t>
       </w:r>
     </w:p>
     <w:p>
@@ -3779,7 +3779,7 @@
           <w:szCs w:val="22"/>
           <w:rFonts w:ascii="Calibri" w:cs="Calibri" w:eastAsia="Calibri" w:hAnsi="Calibri"/>
         </w:rPr>
-        <w:t xml:space="preserve">The GHSS Shangus ERP ecosystem integrates 4 autonomous portals and 22 enterprise administrative tools into a unified, high-performance web architecture. The operational custody of each tool is assigned as follows:</w:t>
+        <w:t xml:space="preserve">The GHSS Shangus ERP ecosystem integrates 4 autonomous portals and 25 enterprise administrative modules across 4 core functional divisions into a unified, high-performance web architecture. The operational custody of each module is assigned as follows:</w:t>
       </w:r>
     </w:p>
     <w:tbl>
@@ -3835,7 +3835,7 @@
         </w:tc>
         <w:tc>
           <w:tcPr>
-            <w:tcW w:type="pct" w:w="24%"/>
+            <w:tcW w:type="pct" w:w="27%"/>
             <w:shd w:fill="0F3460" w:val="clear"/>
             <w:tcMar>
               <w:top w:type="dxa" w:w="100"/>
@@ -3858,13 +3858,13 @@
                 <w:szCs w:val="20"/>
                 <w:rFonts w:ascii="Calibri" w:cs="Calibri" w:eastAsia="Calibri" w:hAnsi="Calibri"/>
               </w:rPr>
-              <w:t xml:space="preserve">Tool / Module Name</w:t>
-            </w:r>
-          </w:p>
-        </w:tc>
-        <w:tc>
-          <w:tcPr>
-            <w:tcW w:type="pct" w:w="46%"/>
+              <w:t xml:space="preserve">Module Name &amp; Division</w:t>
+            </w:r>
+          </w:p>
+        </w:tc>
+        <w:tc>
+          <w:tcPr>
+            <w:tcW w:type="pct" w:w="43%"/>
             <w:shd w:fill="0F3460" w:val="clear"/>
             <w:tcMar>
               <w:top w:type="dxa" w:w="100"/>
@@ -3950,53 +3950,54 @@
         </w:tc>
         <w:tc>
           <w:tcPr>
-            <w:tcW w:type="pct" w:w="24%"/>
-            <w:shd w:fill="FFFFFF" w:val="clear"/>
-            <w:tcMar>
-              <w:top w:type="dxa" w:w="80"/>
-              <w:left w:type="dxa" w:w="120"/>
-              <w:bottom w:type="dxa" w:w="80"/>
-              <w:right w:type="dxa" w:w="120"/>
-            </w:tcMar>
-          </w:tcPr>
-          <w:p>
-            <w:pPr>
-              <w:spacing w:before="20" w:after="20" w:line="240"/>
-            </w:pPr>
-            <w:r>
-              <w:rPr>
-                <w:color w:val="1E293B"/>
-                <w:sz w:val="19"/>
-                <w:szCs w:val="19"/>
-                <w:rFonts w:ascii="Calibri" w:cs="Calibri" w:eastAsia="Calibri" w:hAnsi="Calibri"/>
-              </w:rPr>
-              <w:t xml:space="preserve">Student Central Registry</w:t>
-            </w:r>
-          </w:p>
-        </w:tc>
-        <w:tc>
-          <w:tcPr>
-            <w:tcW w:type="pct" w:w="46%"/>
-            <w:shd w:fill="FFFFFF" w:val="clear"/>
-            <w:tcMar>
-              <w:top w:type="dxa" w:w="80"/>
-              <w:left w:type="dxa" w:w="120"/>
-              <w:bottom w:type="dxa" w:w="80"/>
-              <w:right w:type="dxa" w:w="120"/>
-            </w:tcMar>
-          </w:tcPr>
-          <w:p>
-            <w:pPr>
-              <w:spacing w:before="20" w:after="20" w:line="240"/>
-            </w:pPr>
-            <w:r>
-              <w:rPr>
-                <w:color w:val="1E293B"/>
-                <w:sz w:val="19"/>
-                <w:szCs w:val="19"/>
-                <w:rFonts w:ascii="Calibri" w:cs="Calibri" w:eastAsia="Calibri" w:hAnsi="Calibri"/>
-              </w:rPr>
-              <w:t xml:space="preserve">Class/stream cohort filters, inline quickCellEdit, photo ZIP downloads, bulk status controls.</w:t>
+            <w:tcW w:type="pct" w:w="27%"/>
+            <w:shd w:fill="FFFFFF" w:val="clear"/>
+            <w:tcMar>
+              <w:top w:type="dxa" w:w="80"/>
+              <w:left w:type="dxa" w:w="120"/>
+              <w:bottom w:type="dxa" w:w="80"/>
+              <w:right w:type="dxa" w:w="120"/>
+            </w:tcMar>
+          </w:tcPr>
+          <w:p>
+            <w:pPr>
+              <w:spacing w:before="20" w:after="20" w:line="240"/>
+            </w:pPr>
+            <w:r>
+              <w:rPr>
+                <w:color w:val="1E293B"/>
+                <w:sz w:val="19"/>
+                <w:szCs w:val="19"/>
+                <w:rFonts w:ascii="Calibri" w:cs="Calibri" w:eastAsia="Calibri" w:hAnsi="Calibri"/>
+              </w:rPr>
+              <w:t xml:space="preserve">Student Records &amp; Reports
+[Records &amp; Registers]</w:t>
+            </w:r>
+          </w:p>
+        </w:tc>
+        <w:tc>
+          <w:tcPr>
+            <w:tcW w:type="pct" w:w="43%"/>
+            <w:shd w:fill="FFFFFF" w:val="clear"/>
+            <w:tcMar>
+              <w:top w:type="dxa" w:w="80"/>
+              <w:left w:type="dxa" w:w="120"/>
+              <w:bottom w:type="dxa" w:w="80"/>
+              <w:right w:type="dxa" w:w="120"/>
+            </w:tcMar>
+          </w:tcPr>
+          <w:p>
+            <w:pPr>
+              <w:spacing w:before="20" w:after="20" w:line="240"/>
+            </w:pPr>
+            <w:r>
+              <w:rPr>
+                <w:color w:val="1E293B"/>
+                <w:sz w:val="19"/>
+                <w:szCs w:val="19"/>
+                <w:rFonts w:ascii="Calibri" w:cs="Calibri" w:eastAsia="Calibri" w:hAnsi="Calibri"/>
+              </w:rPr>
+              <w:t xml:space="preserve">Class/stream cohort filters, inline cell edit, photo ZIP downloads, bulk approval status controls.</w:t>
             </w:r>
           </w:p>
         </w:tc>
@@ -4056,33 +4057,34 @@
         </w:tc>
         <w:tc>
           <w:tcPr>
-            <w:tcW w:type="pct" w:w="24%"/>
-            <w:shd w:fill="F8FAFC" w:val="clear"/>
-            <w:tcMar>
-              <w:top w:type="dxa" w:w="80"/>
-              <w:left w:type="dxa" w:w="120"/>
-              <w:bottom w:type="dxa" w:w="80"/>
-              <w:right w:type="dxa" w:w="120"/>
-            </w:tcMar>
-          </w:tcPr>
-          <w:p>
-            <w:pPr>
-              <w:spacing w:before="20" w:after="20" w:line="240"/>
-            </w:pPr>
-            <w:r>
-              <w:rPr>
-                <w:color w:val="1E293B"/>
-                <w:sz w:val="19"/>
-                <w:szCs w:val="19"/>
-                <w:rFonts w:ascii="Calibri" w:cs="Calibri" w:eastAsia="Calibri" w:hAnsi="Calibri"/>
-              </w:rPr>
-              <w:t xml:space="preserve">20-Year Admission Archive</w:t>
-            </w:r>
-          </w:p>
-        </w:tc>
-        <w:tc>
-          <w:tcPr>
-            <w:tcW w:type="pct" w:w="46%"/>
+            <w:tcW w:type="pct" w:w="27%"/>
+            <w:shd w:fill="F8FAFC" w:val="clear"/>
+            <w:tcMar>
+              <w:top w:type="dxa" w:w="80"/>
+              <w:left w:type="dxa" w:w="120"/>
+              <w:bottom w:type="dxa" w:w="80"/>
+              <w:right w:type="dxa" w:w="120"/>
+            </w:tcMar>
+          </w:tcPr>
+          <w:p>
+            <w:pPr>
+              <w:spacing w:before="20" w:after="20" w:line="240"/>
+            </w:pPr>
+            <w:r>
+              <w:rPr>
+                <w:color w:val="1E293B"/>
+                <w:sz w:val="19"/>
+                <w:szCs w:val="19"/>
+                <w:rFonts w:ascii="Calibri" w:cs="Calibri" w:eastAsia="Calibri" w:hAnsi="Calibri"/>
+              </w:rPr>
+              <w:t xml:space="preserve">Admission Register &amp; Sent-up Suite
+[Records &amp; Registers]</w:t>
+            </w:r>
+          </w:p>
+        </w:tc>
+        <w:tc>
+          <w:tcPr>
+            <w:tcW w:type="pct" w:w="43%"/>
             <w:shd w:fill="F8FAFC" w:val="clear"/>
             <w:tcMar>
               <w:top w:type="dxa" w:w="80"/>
@@ -4162,33 +4164,34 @@
         </w:tc>
         <w:tc>
           <w:tcPr>
-            <w:tcW w:type="pct" w:w="24%"/>
-            <w:shd w:fill="FFFFFF" w:val="clear"/>
-            <w:tcMar>
-              <w:top w:type="dxa" w:w="80"/>
-              <w:left w:type="dxa" w:w="120"/>
-              <w:bottom w:type="dxa" w:w="80"/>
-              <w:right w:type="dxa" w:w="120"/>
-            </w:tcMar>
-          </w:tcPr>
-          <w:p>
-            <w:pPr>
-              <w:spacing w:before="20" w:after="20" w:line="240"/>
-            </w:pPr>
-            <w:r>
-              <w:rPr>
-                <w:color w:val="1E293B"/>
-                <w:sz w:val="19"/>
-                <w:szCs w:val="19"/>
-                <w:rFonts w:ascii="Calibri" w:cs="Calibri" w:eastAsia="Calibri" w:hAnsi="Calibri"/>
-              </w:rPr>
-              <w:t xml:space="preserve">Custom Student Roster Builder</w:t>
-            </w:r>
-          </w:p>
-        </w:tc>
-        <w:tc>
-          <w:tcPr>
-            <w:tcW w:type="pct" w:w="46%"/>
+            <w:tcW w:type="pct" w:w="27%"/>
+            <w:shd w:fill="FFFFFF" w:val="clear"/>
+            <w:tcMar>
+              <w:top w:type="dxa" w:w="80"/>
+              <w:left w:type="dxa" w:w="120"/>
+              <w:bottom w:type="dxa" w:w="80"/>
+              <w:right w:type="dxa" w:w="120"/>
+            </w:tcMar>
+          </w:tcPr>
+          <w:p>
+            <w:pPr>
+              <w:spacing w:before="20" w:after="20" w:line="240"/>
+            </w:pPr>
+            <w:r>
+              <w:rPr>
+                <w:color w:val="1E293B"/>
+                <w:sz w:val="19"/>
+                <w:szCs w:val="19"/>
+                <w:rFonts w:ascii="Calibri" w:cs="Calibri" w:eastAsia="Calibri" w:hAnsi="Calibri"/>
+              </w:rPr>
+              <w:t xml:space="preserve">Student Rosters &amp; Registers
+[Records &amp; Registers]</w:t>
+            </w:r>
+          </w:p>
+        </w:tc>
+        <w:tc>
+          <w:tcPr>
+            <w:tcW w:type="pct" w:w="43%"/>
             <w:shd w:fill="FFFFFF" w:val="clear"/>
             <w:tcMar>
               <w:top w:type="dxa" w:w="80"/>
@@ -4268,33 +4271,34 @@
         </w:tc>
         <w:tc>
           <w:tcPr>
-            <w:tcW w:type="pct" w:w="24%"/>
-            <w:shd w:fill="F8FAFC" w:val="clear"/>
-            <w:tcMar>
-              <w:top w:type="dxa" w:w="80"/>
-              <w:left w:type="dxa" w:w="120"/>
-              <w:bottom w:type="dxa" w:w="80"/>
-              <w:right w:type="dxa" w:w="120"/>
-            </w:tcMar>
-          </w:tcPr>
-          <w:p>
-            <w:pPr>
-              <w:spacing w:before="20" w:after="20" w:line="240"/>
-            </w:pPr>
-            <w:r>
-              <w:rPr>
-                <w:color w:val="1E293B"/>
-                <w:sz w:val="19"/>
-                <w:szCs w:val="19"/>
-                <w:rFonts w:ascii="Calibri" w:cs="Calibri" w:eastAsia="Calibri" w:hAnsi="Calibri"/>
-              </w:rPr>
-              <w:t xml:space="preserve">Official Letterhead Writer</w:t>
-            </w:r>
-          </w:p>
-        </w:tc>
-        <w:tc>
-          <w:tcPr>
-            <w:tcW w:type="pct" w:w="46%"/>
+            <w:tcW w:type="pct" w:w="27%"/>
+            <w:shd w:fill="F8FAFC" w:val="clear"/>
+            <w:tcMar>
+              <w:top w:type="dxa" w:w="80"/>
+              <w:left w:type="dxa" w:w="120"/>
+              <w:bottom w:type="dxa" w:w="80"/>
+              <w:right w:type="dxa" w:w="120"/>
+            </w:tcMar>
+          </w:tcPr>
+          <w:p>
+            <w:pPr>
+              <w:spacing w:before="20" w:after="20" w:line="240"/>
+            </w:pPr>
+            <w:r>
+              <w:rPr>
+                <w:color w:val="1E293B"/>
+                <w:sz w:val="19"/>
+                <w:szCs w:val="19"/>
+                <w:rFonts w:ascii="Calibri" w:cs="Calibri" w:eastAsia="Calibri" w:hAnsi="Calibri"/>
+              </w:rPr>
+              <w:t xml:space="preserve">Official Letterhead Writer
+[Records &amp; Registers]</w:t>
+            </w:r>
+          </w:p>
+        </w:tc>
+        <w:tc>
+          <w:tcPr>
+            <w:tcW w:type="pct" w:w="43%"/>
             <w:shd w:fill="F8FAFC" w:val="clear"/>
             <w:tcMar>
               <w:top w:type="dxa" w:w="80"/>
@@ -4374,33 +4378,34 @@
         </w:tc>
         <w:tc>
           <w:tcPr>
-            <w:tcW w:type="pct" w:w="24%"/>
-            <w:shd w:fill="FFFFFF" w:val="clear"/>
-            <w:tcMar>
-              <w:top w:type="dxa" w:w="80"/>
-              <w:left w:type="dxa" w:w="120"/>
-              <w:bottom w:type="dxa" w:w="80"/>
-              <w:right w:type="dxa" w:w="120"/>
-            </w:tcMar>
-          </w:tcPr>
-          <w:p>
-            <w:pPr>
-              <w:spacing w:before="20" w:after="20" w:line="240"/>
-            </w:pPr>
-            <w:r>
-              <w:rPr>
-                <w:color w:val="1E293B"/>
-                <w:sz w:val="19"/>
-                <w:szCs w:val="19"/>
-                <w:rFonts w:ascii="Calibri" w:cs="Calibri" w:eastAsia="Calibri" w:hAnsi="Calibri"/>
-              </w:rPr>
-              <w:t xml:space="preserve">Student Certificate Studio</w:t>
-            </w:r>
-          </w:p>
-        </w:tc>
-        <w:tc>
-          <w:tcPr>
-            <w:tcW w:type="pct" w:w="46%"/>
+            <w:tcW w:type="pct" w:w="27%"/>
+            <w:shd w:fill="FFFFFF" w:val="clear"/>
+            <w:tcMar>
+              <w:top w:type="dxa" w:w="80"/>
+              <w:left w:type="dxa" w:w="120"/>
+              <w:bottom w:type="dxa" w:w="80"/>
+              <w:right w:type="dxa" w:w="120"/>
+            </w:tcMar>
+          </w:tcPr>
+          <w:p>
+            <w:pPr>
+              <w:spacing w:before="20" w:after="20" w:line="240"/>
+            </w:pPr>
+            <w:r>
+              <w:rPr>
+                <w:color w:val="1E293B"/>
+                <w:sz w:val="19"/>
+                <w:szCs w:val="19"/>
+                <w:rFonts w:ascii="Calibri" w:cs="Calibri" w:eastAsia="Calibri" w:hAnsi="Calibri"/>
+              </w:rPr>
+              <w:t xml:space="preserve">Student Bonafides &amp; Certificates
+[Records &amp; Registers]</w:t>
+            </w:r>
+          </w:p>
+        </w:tc>
+        <w:tc>
+          <w:tcPr>
+            <w:tcW w:type="pct" w:w="43%"/>
             <w:shd w:fill="FFFFFF" w:val="clear"/>
             <w:tcMar>
               <w:top w:type="dxa" w:w="80"/>
@@ -4480,33 +4485,34 @@
         </w:tc>
         <w:tc>
           <w:tcPr>
-            <w:tcW w:type="pct" w:w="24%"/>
-            <w:shd w:fill="F8FAFC" w:val="clear"/>
-            <w:tcMar>
-              <w:top w:type="dxa" w:w="80"/>
-              <w:left w:type="dxa" w:w="120"/>
-              <w:bottom w:type="dxa" w:w="80"/>
-              <w:right w:type="dxa" w:w="120"/>
-            </w:tcMar>
-          </w:tcPr>
-          <w:p>
-            <w:pPr>
-              <w:spacing w:before="20" w:after="20" w:line="240"/>
-            </w:pPr>
-            <w:r>
-              <w:rPr>
-                <w:color w:val="1E293B"/>
-                <w:sz w:val="19"/>
-                <w:szCs w:val="19"/>
-                <w:rFonts w:ascii="Calibri" w:cs="Calibri" w:eastAsia="Calibri" w:hAnsi="Calibri"/>
-              </w:rPr>
-              <w:t xml:space="preserve">Student Identity Card Studio</w:t>
-            </w:r>
-          </w:p>
-        </w:tc>
-        <w:tc>
-          <w:tcPr>
-            <w:tcW w:type="pct" w:w="46%"/>
+            <w:tcW w:type="pct" w:w="27%"/>
+            <w:shd w:fill="F8FAFC" w:val="clear"/>
+            <w:tcMar>
+              <w:top w:type="dxa" w:w="80"/>
+              <w:left w:type="dxa" w:w="120"/>
+              <w:bottom w:type="dxa" w:w="80"/>
+              <w:right w:type="dxa" w:w="120"/>
+            </w:tcMar>
+          </w:tcPr>
+          <w:p>
+            <w:pPr>
+              <w:spacing w:before="20" w:after="20" w:line="240"/>
+            </w:pPr>
+            <w:r>
+              <w:rPr>
+                <w:color w:val="1E293B"/>
+                <w:sz w:val="19"/>
+                <w:szCs w:val="19"/>
+                <w:rFonts w:ascii="Calibri" w:cs="Calibri" w:eastAsia="Calibri" w:hAnsi="Calibri"/>
+              </w:rPr>
+              <w:t xml:space="preserve">Student Identity Card Studio
+[Records &amp; Registers]</w:t>
+            </w:r>
+          </w:p>
+        </w:tc>
+        <w:tc>
+          <w:tcPr>
+            <w:tcW w:type="pct" w:w="43%"/>
             <w:shd w:fill="F8FAFC" w:val="clear"/>
             <w:tcMar>
               <w:top w:type="dxa" w:w="80"/>
@@ -4586,33 +4592,34 @@
         </w:tc>
         <w:tc>
           <w:tcPr>
-            <w:tcW w:type="pct" w:w="24%"/>
-            <w:shd w:fill="FFFFFF" w:val="clear"/>
-            <w:tcMar>
-              <w:top w:type="dxa" w:w="80"/>
-              <w:left w:type="dxa" w:w="120"/>
-              <w:bottom w:type="dxa" w:w="80"/>
-              <w:right w:type="dxa" w:w="120"/>
-            </w:tcMar>
-          </w:tcPr>
-          <w:p>
-            <w:pPr>
-              <w:spacing w:before="20" w:after="20" w:line="240"/>
-            </w:pPr>
-            <w:r>
-              <w:rPr>
-                <w:color w:val="1E293B"/>
-                <w:sz w:val="19"/>
-                <w:szCs w:val="19"/>
-                <w:rFonts w:ascii="Calibri" w:cs="Calibri" w:eastAsia="Calibri" w:hAnsi="Calibri"/>
-              </w:rPr>
-              <w:t xml:space="preserve">Competitive Exams &amp; OMR Suite</w:t>
-            </w:r>
-          </w:p>
-        </w:tc>
-        <w:tc>
-          <w:tcPr>
-            <w:tcW w:type="pct" w:w="46%"/>
+            <w:tcW w:type="pct" w:w="27%"/>
+            <w:shd w:fill="FFFFFF" w:val="clear"/>
+            <w:tcMar>
+              <w:top w:type="dxa" w:w="80"/>
+              <w:left w:type="dxa" w:w="120"/>
+              <w:bottom w:type="dxa" w:w="80"/>
+              <w:right w:type="dxa" w:w="120"/>
+            </w:tcMar>
+          </w:tcPr>
+          <w:p>
+            <w:pPr>
+              <w:spacing w:before="20" w:after="20" w:line="240"/>
+            </w:pPr>
+            <w:r>
+              <w:rPr>
+                <w:color w:val="1E293B"/>
+                <w:sz w:val="19"/>
+                <w:szCs w:val="19"/>
+                <w:rFonts w:ascii="Calibri" w:cs="Calibri" w:eastAsia="Calibri" w:hAnsi="Calibri"/>
+              </w:rPr>
+              <w:t xml:space="preserve">Competitive Exams &amp; OMR Suite
+[Records &amp; Registers]</w:t>
+            </w:r>
+          </w:p>
+        </w:tc>
+        <w:tc>
+          <w:tcPr>
+            <w:tcW w:type="pct" w:w="43%"/>
             <w:shd w:fill="FFFFFF" w:val="clear"/>
             <w:tcMar>
               <w:top w:type="dxa" w:w="80"/>
@@ -4692,53 +4699,54 @@
         </w:tc>
         <w:tc>
           <w:tcPr>
-            <w:tcW w:type="pct" w:w="24%"/>
-            <w:shd w:fill="F8FAFC" w:val="clear"/>
-            <w:tcMar>
-              <w:top w:type="dxa" w:w="80"/>
-              <w:left w:type="dxa" w:w="120"/>
-              <w:bottom w:type="dxa" w:w="80"/>
-              <w:right w:type="dxa" w:w="120"/>
-            </w:tcMar>
-          </w:tcPr>
-          <w:p>
-            <w:pPr>
-              <w:spacing w:before="20" w:after="20" w:line="240"/>
-            </w:pPr>
-            <w:r>
-              <w:rPr>
-                <w:color w:val="1E293B"/>
-                <w:sz w:val="19"/>
-                <w:szCs w:val="19"/>
-                <w:rFonts w:ascii="Calibri" w:cs="Calibri" w:eastAsia="Calibri" w:hAnsi="Calibri"/>
-              </w:rPr>
-              <w:t xml:space="preserve">Academic Intake Controls</w:t>
-            </w:r>
-          </w:p>
-        </w:tc>
-        <w:tc>
-          <w:tcPr>
-            <w:tcW w:type="pct" w:w="46%"/>
-            <w:shd w:fill="F8FAFC" w:val="clear"/>
-            <w:tcMar>
-              <w:top w:type="dxa" w:w="80"/>
-              <w:left w:type="dxa" w:w="120"/>
-              <w:bottom w:type="dxa" w:w="80"/>
-              <w:right w:type="dxa" w:w="120"/>
-            </w:tcMar>
-          </w:tcPr>
-          <w:p>
-            <w:pPr>
-              <w:spacing w:before="20" w:after="20" w:line="240"/>
-            </w:pPr>
-            <w:r>
-              <w:rPr>
-                <w:color w:val="1E293B"/>
-                <w:sz w:val="19"/>
-                <w:szCs w:val="19"/>
-                <w:rFonts w:ascii="Calibri" w:cs="Calibri" w:eastAsia="Calibri" w:hAnsi="Calibri"/>
-              </w:rPr>
-              <w:t xml:space="preserve">Live admission intake toggles for Classes 9th–12th, stream quotas (Medical, Non-Med, Arts, Commerce).</w:t>
+            <w:tcW w:type="pct" w:w="27%"/>
+            <w:shd w:fill="F8FAFC" w:val="clear"/>
+            <w:tcMar>
+              <w:top w:type="dxa" w:w="80"/>
+              <w:left w:type="dxa" w:w="120"/>
+              <w:bottom w:type="dxa" w:w="80"/>
+              <w:right w:type="dxa" w:w="120"/>
+            </w:tcMar>
+          </w:tcPr>
+          <w:p>
+            <w:pPr>
+              <w:spacing w:before="20" w:after="20" w:line="240"/>
+            </w:pPr>
+            <w:r>
+              <w:rPr>
+                <w:color w:val="1E293B"/>
+                <w:sz w:val="19"/>
+                <w:szCs w:val="19"/>
+                <w:rFonts w:ascii="Calibri" w:cs="Calibri" w:eastAsia="Calibri" w:hAnsi="Calibri"/>
+              </w:rPr>
+              <w:t xml:space="preserve">System &amp; Admission Controls
+[Academics &amp; Controls]</w:t>
+            </w:r>
+          </w:p>
+        </w:tc>
+        <w:tc>
+          <w:tcPr>
+            <w:tcW w:type="pct" w:w="43%"/>
+            <w:shd w:fill="F8FAFC" w:val="clear"/>
+            <w:tcMar>
+              <w:top w:type="dxa" w:w="80"/>
+              <w:left w:type="dxa" w:w="120"/>
+              <w:bottom w:type="dxa" w:w="80"/>
+              <w:right w:type="dxa" w:w="120"/>
+            </w:tcMar>
+          </w:tcPr>
+          <w:p>
+            <w:pPr>
+              <w:spacing w:before="20" w:after="20" w:line="240"/>
+            </w:pPr>
+            <w:r>
+              <w:rPr>
+                <w:color w:val="1E293B"/>
+                <w:sz w:val="19"/>
+                <w:szCs w:val="19"/>
+                <w:rFonts w:ascii="Calibri" w:cs="Calibri" w:eastAsia="Calibri" w:hAnsi="Calibri"/>
+              </w:rPr>
+              <w:t xml:space="preserve">Live admission intake toggles for Classes 9th–12th, stream quotas (Medical, Non-Med, Arts, Commerce), session rollover.</w:t>
             </w:r>
           </w:p>
         </w:tc>
@@ -4798,53 +4806,54 @@
         </w:tc>
         <w:tc>
           <w:tcPr>
-            <w:tcW w:type="pct" w:w="24%"/>
-            <w:shd w:fill="FFFFFF" w:val="clear"/>
-            <w:tcMar>
-              <w:top w:type="dxa" w:w="80"/>
-              <w:left w:type="dxa" w:w="120"/>
-              <w:bottom w:type="dxa" w:w="80"/>
-              <w:right w:type="dxa" w:w="120"/>
-            </w:tcMar>
-          </w:tcPr>
-          <w:p>
-            <w:pPr>
-              <w:spacing w:before="20" w:after="20" w:line="240"/>
-            </w:pPr>
-            <w:r>
-              <w:rPr>
-                <w:color w:val="1E293B"/>
-                <w:sz w:val="19"/>
-                <w:szCs w:val="19"/>
-                <w:rFonts w:ascii="Calibri" w:cs="Calibri" w:eastAsia="Calibri" w:hAnsi="Calibri"/>
-              </w:rPr>
-              <w:t xml:space="preserve">Subject Combination Enforcer</w:t>
-            </w:r>
-          </w:p>
-        </w:tc>
-        <w:tc>
-          <w:tcPr>
-            <w:tcW w:type="pct" w:w="46%"/>
-            <w:shd w:fill="FFFFFF" w:val="clear"/>
-            <w:tcMar>
-              <w:top w:type="dxa" w:w="80"/>
-              <w:left w:type="dxa" w:w="120"/>
-              <w:bottom w:type="dxa" w:w="80"/>
-              <w:right w:type="dxa" w:w="120"/>
-            </w:tcMar>
-          </w:tcPr>
-          <w:p>
-            <w:pPr>
-              <w:spacing w:before="20" w:after="20" w:line="240"/>
-            </w:pPr>
-            <w:r>
-              <w:rPr>
-                <w:color w:val="1E293B"/>
-                <w:sz w:val="19"/>
-                <w:szCs w:val="19"/>
-                <w:rFonts w:ascii="Calibri" w:cs="Calibri" w:eastAsia="Calibri" w:hAnsi="Calibri"/>
-              </w:rPr>
-              <w:t xml:space="preserve">Rule-based curriculum validator enforcing JKBOSE compulsory and elective subject combination limits.</w:t>
+            <w:tcW w:type="pct" w:w="27%"/>
+            <w:shd w:fill="FFFFFF" w:val="clear"/>
+            <w:tcMar>
+              <w:top w:type="dxa" w:w="80"/>
+              <w:left w:type="dxa" w:w="120"/>
+              <w:bottom w:type="dxa" w:w="80"/>
+              <w:right w:type="dxa" w:w="120"/>
+            </w:tcMar>
+          </w:tcPr>
+          <w:p>
+            <w:pPr>
+              <w:spacing w:before="20" w:after="20" w:line="240"/>
+            </w:pPr>
+            <w:r>
+              <w:rPr>
+                <w:color w:val="1E293B"/>
+                <w:sz w:val="19"/>
+                <w:szCs w:val="19"/>
+                <w:rFonts w:ascii="Calibri" w:cs="Calibri" w:eastAsia="Calibri" w:hAnsi="Calibri"/>
+              </w:rPr>
+              <w:t xml:space="preserve">Subjects, Streams &amp; Feeder Schools
+[Academics &amp; Controls]</w:t>
+            </w:r>
+          </w:p>
+        </w:tc>
+        <w:tc>
+          <w:tcPr>
+            <w:tcW w:type="pct" w:w="43%"/>
+            <w:shd w:fill="FFFFFF" w:val="clear"/>
+            <w:tcMar>
+              <w:top w:type="dxa" w:w="80"/>
+              <w:left w:type="dxa" w:w="120"/>
+              <w:bottom w:type="dxa" w:w="80"/>
+              <w:right w:type="dxa" w:w="120"/>
+            </w:tcMar>
+          </w:tcPr>
+          <w:p>
+            <w:pPr>
+              <w:spacing w:before="20" w:after="20" w:line="240"/>
+            </w:pPr>
+            <w:r>
+              <w:rPr>
+                <w:color w:val="1E293B"/>
+                <w:sz w:val="19"/>
+                <w:szCs w:val="19"/>
+                <w:rFonts w:ascii="Calibri" w:cs="Calibri" w:eastAsia="Calibri" w:hAnsi="Calibri"/>
+              </w:rPr>
+              <w:t xml:space="preserve">Rule-based curriculum validator enforcing JKBOSE compulsory and elective subject combination limits &amp; feeder school sync.</w:t>
             </w:r>
           </w:p>
         </w:tc>
@@ -4904,33 +4913,34 @@
         </w:tc>
         <w:tc>
           <w:tcPr>
-            <w:tcW w:type="pct" w:w="24%"/>
-            <w:shd w:fill="F8FAFC" w:val="clear"/>
-            <w:tcMar>
-              <w:top w:type="dxa" w:w="80"/>
-              <w:left w:type="dxa" w:w="120"/>
-              <w:bottom w:type="dxa" w:w="80"/>
-              <w:right w:type="dxa" w:w="120"/>
-            </w:tcMar>
-          </w:tcPr>
-          <w:p>
-            <w:pPr>
-              <w:spacing w:before="20" w:after="20" w:line="240"/>
-            </w:pPr>
-            <w:r>
-              <w:rPr>
-                <w:color w:val="1E293B"/>
-                <w:sz w:val="19"/>
-                <w:szCs w:val="19"/>
-                <w:rFonts w:ascii="Calibri" w:cs="Calibri" w:eastAsia="Calibri" w:hAnsi="Calibri"/>
-              </w:rPr>
-              <w:t xml:space="preserve">Practical Marks &amp; Award Rolls</w:t>
-            </w:r>
-          </w:p>
-        </w:tc>
-        <w:tc>
-          <w:tcPr>
-            <w:tcW w:type="pct" w:w="46%"/>
+            <w:tcW w:type="pct" w:w="27%"/>
+            <w:shd w:fill="F8FAFC" w:val="clear"/>
+            <w:tcMar>
+              <w:top w:type="dxa" w:w="80"/>
+              <w:left w:type="dxa" w:w="120"/>
+              <w:bottom w:type="dxa" w:w="80"/>
+              <w:right w:type="dxa" w:w="120"/>
+            </w:tcMar>
+          </w:tcPr>
+          <w:p>
+            <w:pPr>
+              <w:spacing w:before="20" w:after="20" w:line="240"/>
+            </w:pPr>
+            <w:r>
+              <w:rPr>
+                <w:color w:val="1E293B"/>
+                <w:sz w:val="19"/>
+                <w:szCs w:val="19"/>
+                <w:rFonts w:ascii="Calibri" w:cs="Calibri" w:eastAsia="Calibri" w:hAnsi="Calibri"/>
+              </w:rPr>
+              <w:t xml:space="preserve">Practicals &amp; Award Rolls
+[Academics &amp; Controls]</w:t>
+            </w:r>
+          </w:p>
+        </w:tc>
+        <w:tc>
+          <w:tcPr>
+            <w:tcW w:type="pct" w:w="43%"/>
             <w:shd w:fill="F8FAFC" w:val="clear"/>
             <w:tcMar>
               <w:top w:type="dxa" w:w="80"/>
@@ -5010,33 +5020,34 @@
         </w:tc>
         <w:tc>
           <w:tcPr>
-            <w:tcW w:type="pct" w:w="24%"/>
-            <w:shd w:fill="FFFFFF" w:val="clear"/>
-            <w:tcMar>
-              <w:top w:type="dxa" w:w="80"/>
-              <w:left w:type="dxa" w:w="120"/>
-              <w:bottom w:type="dxa" w:w="80"/>
-              <w:right w:type="dxa" w:w="120"/>
-            </w:tcMar>
-          </w:tcPr>
-          <w:p>
-            <w:pPr>
-              <w:spacing w:before="20" w:after="20" w:line="240"/>
-            </w:pPr>
-            <w:r>
-              <w:rPr>
-                <w:color w:val="1E293B"/>
-                <w:sz w:val="19"/>
-                <w:szCs w:val="19"/>
-                <w:rFonts w:ascii="Calibri" w:cs="Calibri" w:eastAsia="Calibri" w:hAnsi="Calibri"/>
-              </w:rPr>
-              <w:t xml:space="preserve">Student Attendance Tracker</w:t>
-            </w:r>
-          </w:p>
-        </w:tc>
-        <w:tc>
-          <w:tcPr>
-            <w:tcW w:type="pct" w:w="46%"/>
+            <w:tcW w:type="pct" w:w="27%"/>
+            <w:shd w:fill="FFFFFF" w:val="clear"/>
+            <w:tcMar>
+              <w:top w:type="dxa" w:w="80"/>
+              <w:left w:type="dxa" w:w="120"/>
+              <w:bottom w:type="dxa" w:w="80"/>
+              <w:right w:type="dxa" w:w="120"/>
+            </w:tcMar>
+          </w:tcPr>
+          <w:p>
+            <w:pPr>
+              <w:spacing w:before="20" w:after="20" w:line="240"/>
+            </w:pPr>
+            <w:r>
+              <w:rPr>
+                <w:color w:val="1E293B"/>
+                <w:sz w:val="19"/>
+                <w:szCs w:val="19"/>
+                <w:rFonts w:ascii="Calibri" w:cs="Calibri" w:eastAsia="Calibri" w:hAnsi="Calibri"/>
+              </w:rPr>
+              <w:t xml:space="preserve">Student Attendance Tracker
+[Academics &amp; Controls]</w:t>
+            </w:r>
+          </w:p>
+        </w:tc>
+        <w:tc>
+          <w:tcPr>
+            <w:tcW w:type="pct" w:w="43%"/>
             <w:shd w:fill="FFFFFF" w:val="clear"/>
             <w:tcMar>
               <w:top w:type="dxa" w:w="80"/>
@@ -5116,33 +5127,34 @@
         </w:tc>
         <w:tc>
           <w:tcPr>
-            <w:tcW w:type="pct" w:w="24%"/>
-            <w:shd w:fill="F8FAFC" w:val="clear"/>
-            <w:tcMar>
-              <w:top w:type="dxa" w:w="80"/>
-              <w:left w:type="dxa" w:w="120"/>
-              <w:bottom w:type="dxa" w:w="80"/>
-              <w:right w:type="dxa" w:w="120"/>
-            </w:tcMar>
-          </w:tcPr>
-          <w:p>
-            <w:pPr>
-              <w:spacing w:before="20" w:after="20" w:line="240"/>
-            </w:pPr>
-            <w:r>
-              <w:rPr>
-                <w:color w:val="1E293B"/>
-                <w:sz w:val="19"/>
-                <w:szCs w:val="19"/>
-                <w:rFonts w:ascii="Calibri" w:cs="Calibri" w:eastAsia="Calibri" w:hAnsi="Calibri"/>
-              </w:rPr>
-              <w:t xml:space="preserve">Class Roll Number Generator</w:t>
-            </w:r>
-          </w:p>
-        </w:tc>
-        <w:tc>
-          <w:tcPr>
-            <w:tcW w:type="pct" w:w="46%"/>
+            <w:tcW w:type="pct" w:w="27%"/>
+            <w:shd w:fill="F8FAFC" w:val="clear"/>
+            <w:tcMar>
+              <w:top w:type="dxa" w:w="80"/>
+              <w:left w:type="dxa" w:w="120"/>
+              <w:bottom w:type="dxa" w:w="80"/>
+              <w:right w:type="dxa" w:w="120"/>
+            </w:tcMar>
+          </w:tcPr>
+          <w:p>
+            <w:pPr>
+              <w:spacing w:before="20" w:after="20" w:line="240"/>
+            </w:pPr>
+            <w:r>
+              <w:rPr>
+                <w:color w:val="1E293B"/>
+                <w:sz w:val="19"/>
+                <w:szCs w:val="19"/>
+                <w:rFonts w:ascii="Calibri" w:cs="Calibri" w:eastAsia="Calibri" w:hAnsi="Calibri"/>
+              </w:rPr>
+              <w:t xml:space="preserve">Class Roll Number Manager
+[Academics &amp; Controls]</w:t>
+            </w:r>
+          </w:p>
+        </w:tc>
+        <w:tc>
+          <w:tcPr>
+            <w:tcW w:type="pct" w:w="43%"/>
             <w:shd w:fill="F8FAFC" w:val="clear"/>
             <w:tcMar>
               <w:top w:type="dxa" w:w="80"/>
@@ -5222,53 +5234,54 @@
         </w:tc>
         <w:tc>
           <w:tcPr>
-            <w:tcW w:type="pct" w:w="24%"/>
-            <w:shd w:fill="FFFFFF" w:val="clear"/>
-            <w:tcMar>
-              <w:top w:type="dxa" w:w="80"/>
-              <w:left w:type="dxa" w:w="120"/>
-              <w:bottom w:type="dxa" w:w="80"/>
-              <w:right w:type="dxa" w:w="120"/>
-            </w:tcMar>
-          </w:tcPr>
-          <w:p>
-            <w:pPr>
-              <w:spacing w:before="20" w:after="20" w:line="240"/>
-            </w:pPr>
-            <w:r>
-              <w:rPr>
-                <w:color w:val="1E293B"/>
-                <w:sz w:val="19"/>
-                <w:szCs w:val="19"/>
-                <w:rFonts w:ascii="Calibri" w:cs="Calibri" w:eastAsia="Calibri" w:hAnsi="Calibri"/>
-              </w:rPr>
-              <w:t xml:space="preserve">Application Merge Studio</w:t>
-            </w:r>
-          </w:p>
-        </w:tc>
-        <w:tc>
-          <w:tcPr>
-            <w:tcW w:type="pct" w:w="46%"/>
-            <w:shd w:fill="FFFFFF" w:val="clear"/>
-            <w:tcMar>
-              <w:top w:type="dxa" w:w="80"/>
-              <w:left w:type="dxa" w:w="120"/>
-              <w:bottom w:type="dxa" w:w="80"/>
-              <w:right w:type="dxa" w:w="120"/>
-            </w:tcMar>
-          </w:tcPr>
-          <w:p>
-            <w:pPr>
-              <w:spacing w:before="20" w:after="20" w:line="240"/>
-            </w:pPr>
-            <w:r>
-              <w:rPr>
-                <w:color w:val="1E293B"/>
-                <w:sz w:val="19"/>
-                <w:szCs w:val="19"/>
-                <w:rFonts w:ascii="Calibri" w:cs="Calibri" w:eastAsia="Calibri" w:hAnsi="Calibri"/>
-              </w:rPr>
-              <w:t xml:space="preserve">Deduplication studio identifying duplicates by Aadhaar/Phone/RegNo with side-by-side field merge.</w:t>
+            <w:tcW w:type="pct" w:w="27%"/>
+            <w:shd w:fill="FFFFFF" w:val="clear"/>
+            <w:tcMar>
+              <w:top w:type="dxa" w:w="80"/>
+              <w:left w:type="dxa" w:w="120"/>
+              <w:bottom w:type="dxa" w:w="80"/>
+              <w:right w:type="dxa" w:w="120"/>
+            </w:tcMar>
+          </w:tcPr>
+          <w:p>
+            <w:pPr>
+              <w:spacing w:before="20" w:after="20" w:line="240"/>
+            </w:pPr>
+            <w:r>
+              <w:rPr>
+                <w:color w:val="1E293B"/>
+                <w:sz w:val="19"/>
+                <w:szCs w:val="19"/>
+                <w:rFonts w:ascii="Calibri" w:cs="Calibri" w:eastAsia="Calibri" w:hAnsi="Calibri"/>
+              </w:rPr>
+              <w:t xml:space="preserve">Application Merge &amp; Deduplication
+[Operations &amp; Automation]</w:t>
+            </w:r>
+          </w:p>
+        </w:tc>
+        <w:tc>
+          <w:tcPr>
+            <w:tcW w:type="pct" w:w="43%"/>
+            <w:shd w:fill="FFFFFF" w:val="clear"/>
+            <w:tcMar>
+              <w:top w:type="dxa" w:w="80"/>
+              <w:left w:type="dxa" w:w="120"/>
+              <w:bottom w:type="dxa" w:w="80"/>
+              <w:right w:type="dxa" w:w="120"/>
+            </w:tcMar>
+          </w:tcPr>
+          <w:p>
+            <w:pPr>
+              <w:spacing w:before="20" w:after="20" w:line="240"/>
+            </w:pPr>
+            <w:r>
+              <w:rPr>
+                <w:color w:val="1E293B"/>
+                <w:sz w:val="19"/>
+                <w:szCs w:val="19"/>
+                <w:rFonts w:ascii="Calibri" w:cs="Calibri" w:eastAsia="Calibri" w:hAnsi="Calibri"/>
+              </w:rPr>
+              <w:t xml:space="preserve">Deduplication studio identifying duplicates by Aadhaar/Phone/RegNo with side-by-side field merge &amp; 90-day trash safety.</w:t>
             </w:r>
           </w:p>
         </w:tc>
@@ -5328,33 +5341,34 @@
         </w:tc>
         <w:tc>
           <w:tcPr>
-            <w:tcW w:type="pct" w:w="24%"/>
-            <w:shd w:fill="F8FAFC" w:val="clear"/>
-            <w:tcMar>
-              <w:top w:type="dxa" w:w="80"/>
-              <w:left w:type="dxa" w:w="120"/>
-              <w:bottom w:type="dxa" w:w="80"/>
-              <w:right w:type="dxa" w:w="120"/>
-            </w:tcMar>
-          </w:tcPr>
-          <w:p>
-            <w:pPr>
-              <w:spacing w:before="20" w:after="20" w:line="240"/>
-            </w:pPr>
-            <w:r>
-              <w:rPr>
-                <w:color w:val="1E293B"/>
-                <w:sz w:val="19"/>
-                <w:szCs w:val="19"/>
-                <w:rFonts w:ascii="Calibri" w:cs="Calibri" w:eastAsia="Calibri" w:hAnsi="Calibri"/>
-              </w:rPr>
-              <w:t xml:space="preserve">Group Communications Suite</w:t>
-            </w:r>
-          </w:p>
-        </w:tc>
-        <w:tc>
-          <w:tcPr>
-            <w:tcW w:type="pct" w:w="46%"/>
+            <w:tcW w:type="pct" w:w="27%"/>
+            <w:shd w:fill="F8FAFC" w:val="clear"/>
+            <w:tcMar>
+              <w:top w:type="dxa" w:w="80"/>
+              <w:left w:type="dxa" w:w="120"/>
+              <w:bottom w:type="dxa" w:w="80"/>
+              <w:right w:type="dxa" w:w="120"/>
+            </w:tcMar>
+          </w:tcPr>
+          <w:p>
+            <w:pPr>
+              <w:spacing w:before="20" w:after="20" w:line="240"/>
+            </w:pPr>
+            <w:r>
+              <w:rPr>
+                <w:color w:val="1E293B"/>
+                <w:sz w:val="19"/>
+                <w:szCs w:val="19"/>
+                <w:rFonts w:ascii="Calibri" w:cs="Calibri" w:eastAsia="Calibri" w:hAnsi="Calibri"/>
+              </w:rPr>
+              <w:t xml:space="preserve">Communications &amp; Automations
+[Operations &amp; Automation]</w:t>
+            </w:r>
+          </w:p>
+        </w:tc>
+        <w:tc>
+          <w:tcPr>
+            <w:tcW w:type="pct" w:w="43%"/>
             <w:shd w:fill="F8FAFC" w:val="clear"/>
             <w:tcMar>
               <w:top w:type="dxa" w:w="80"/>
@@ -5434,53 +5448,54 @@
         </w:tc>
         <w:tc>
           <w:tcPr>
-            <w:tcW w:type="pct" w:w="24%"/>
-            <w:shd w:fill="FFFFFF" w:val="clear"/>
-            <w:tcMar>
-              <w:top w:type="dxa" w:w="80"/>
-              <w:left w:type="dxa" w:w="120"/>
-              <w:bottom w:type="dxa" w:w="80"/>
-              <w:right w:type="dxa" w:w="120"/>
-            </w:tcMar>
-          </w:tcPr>
-          <w:p>
-            <w:pPr>
-              <w:spacing w:before="20" w:after="20" w:line="240"/>
-            </w:pPr>
-            <w:r>
-              <w:rPr>
-                <w:color w:val="1E293B"/>
-                <w:sz w:val="19"/>
-                <w:szCs w:val="19"/>
-                <w:rFonts w:ascii="Calibri" w:cs="Calibri" w:eastAsia="Calibri" w:hAnsi="Calibri"/>
-              </w:rPr>
-              <w:t xml:space="preserve">Staff Accounts &amp; Income Tax</w:t>
-            </w:r>
-          </w:p>
-        </w:tc>
-        <w:tc>
-          <w:tcPr>
-            <w:tcW w:type="pct" w:w="46%"/>
-            <w:shd w:fill="FFFFFF" w:val="clear"/>
-            <w:tcMar>
-              <w:top w:type="dxa" w:w="80"/>
-              <w:left w:type="dxa" w:w="120"/>
-              <w:bottom w:type="dxa" w:w="80"/>
-              <w:right w:type="dxa" w:w="120"/>
-            </w:tcMar>
-          </w:tcPr>
-          <w:p>
-            <w:pPr>
-              <w:spacing w:before="20" w:after="20" w:line="240"/>
-            </w:pPr>
-            <w:r>
-              <w:rPr>
-                <w:color w:val="1E293B"/>
-                <w:sz w:val="19"/>
-                <w:szCs w:val="19"/>
-                <w:rFonts w:ascii="Calibri" w:cs="Calibri" w:eastAsia="Calibri" w:hAnsi="Calibri"/>
-              </w:rPr>
-              <w:t xml:space="preserve">Pay slip viewer, automated tax liability calculator for UT employees comparing Old vs. New tax regimes.</w:t>
+            <w:tcW w:type="pct" w:w="27%"/>
+            <w:shd w:fill="FFFFFF" w:val="clear"/>
+            <w:tcMar>
+              <w:top w:type="dxa" w:w="80"/>
+              <w:left w:type="dxa" w:w="120"/>
+              <w:bottom w:type="dxa" w:w="80"/>
+              <w:right w:type="dxa" w:w="120"/>
+            </w:tcMar>
+          </w:tcPr>
+          <w:p>
+            <w:pPr>
+              <w:spacing w:before="20" w:after="20" w:line="240"/>
+            </w:pPr>
+            <w:r>
+              <w:rPr>
+                <w:color w:val="1E293B"/>
+                <w:sz w:val="19"/>
+                <w:szCs w:val="19"/>
+                <w:rFonts w:ascii="Calibri" w:cs="Calibri" w:eastAsia="Calibri" w:hAnsi="Calibri"/>
+              </w:rPr>
+              <w:t xml:space="preserve">14+ Subsidiary Funds &amp; Fee Accounts
+[Operations &amp; Automation]</w:t>
+            </w:r>
+          </w:p>
+        </w:tc>
+        <w:tc>
+          <w:tcPr>
+            <w:tcW w:type="pct" w:w="43%"/>
+            <w:shd w:fill="FFFFFF" w:val="clear"/>
+            <w:tcMar>
+              <w:top w:type="dxa" w:w="80"/>
+              <w:left w:type="dxa" w:w="120"/>
+              <w:bottom w:type="dxa" w:w="80"/>
+              <w:right w:type="dxa" w:w="120"/>
+            </w:tcMar>
+          </w:tcPr>
+          <w:p>
+            <w:pPr>
+              <w:spacing w:before="20" w:after="20" w:line="240"/>
+            </w:pPr>
+            <w:r>
+              <w:rPr>
+                <w:color w:val="1E293B"/>
+                <w:sz w:val="19"/>
+                <w:szCs w:val="19"/>
+                <w:rFonts w:ascii="Calibri" w:cs="Calibri" w:eastAsia="Calibri" w:hAnsi="Calibri"/>
+              </w:rPr>
+              <w:t xml:space="preserve">Central fee tracking, automated allocation into 14+ funds (Sports, Red Cross, Library, Lab, Development).</w:t>
             </w:r>
           </w:p>
         </w:tc>
@@ -5506,7 +5521,7 @@
                 <w:szCs w:val="19"/>
                 <w:rFonts w:ascii="Calibri" w:cs="Calibri" w:eastAsia="Calibri" w:hAnsi="Calibri"/>
               </w:rPr>
-              <w:t xml:space="preserve">Head Assistant &amp; Accounts Cell</w:t>
+              <w:t xml:space="preserve">Accounts Incharge &amp; Cashier</w:t>
             </w:r>
           </w:p>
         </w:tc>
@@ -5540,53 +5555,54 @@
         </w:tc>
         <w:tc>
           <w:tcPr>
-            <w:tcW w:type="pct" w:w="24%"/>
-            <w:shd w:fill="F8FAFC" w:val="clear"/>
-            <w:tcMar>
-              <w:top w:type="dxa" w:w="80"/>
-              <w:left w:type="dxa" w:w="120"/>
-              <w:bottom w:type="dxa" w:w="80"/>
-              <w:right w:type="dxa" w:w="120"/>
-            </w:tcMar>
-          </w:tcPr>
-          <w:p>
-            <w:pPr>
-              <w:spacing w:before="20" w:after="20" w:line="240"/>
-            </w:pPr>
-            <w:r>
-              <w:rPr>
-                <w:color w:val="1E293B"/>
-                <w:sz w:val="19"/>
-                <w:szCs w:val="19"/>
-                <w:rFonts w:ascii="Calibri" w:cs="Calibri" w:eastAsia="Calibri" w:hAnsi="Calibri"/>
-              </w:rPr>
-              <w:t xml:space="preserve">14+ Subsidiary Fund Splitter</w:t>
-            </w:r>
-          </w:p>
-        </w:tc>
-        <w:tc>
-          <w:tcPr>
-            <w:tcW w:type="pct" w:w="46%"/>
-            <w:shd w:fill="F8FAFC" w:val="clear"/>
-            <w:tcMar>
-              <w:top w:type="dxa" w:w="80"/>
-              <w:left w:type="dxa" w:w="120"/>
-              <w:bottom w:type="dxa" w:w="80"/>
-              <w:right w:type="dxa" w:w="120"/>
-            </w:tcMar>
-          </w:tcPr>
-          <w:p>
-            <w:pPr>
-              <w:spacing w:before="20" w:after="20" w:line="240"/>
-            </w:pPr>
-            <w:r>
-              <w:rPr>
-                <w:color w:val="1E293B"/>
-                <w:sz w:val="19"/>
-                <w:szCs w:val="19"/>
-                <w:rFonts w:ascii="Calibri" w:cs="Calibri" w:eastAsia="Calibri" w:hAnsi="Calibri"/>
-              </w:rPr>
-              <w:t xml:space="preserve">Central fee tracking, automated allocation into 14+ funds (Sports, Red Cross, Library, Lab, Development).</w:t>
+            <w:tcW w:type="pct" w:w="27%"/>
+            <w:shd w:fill="F8FAFC" w:val="clear"/>
+            <w:tcMar>
+              <w:top w:type="dxa" w:w="80"/>
+              <w:left w:type="dxa" w:w="120"/>
+              <w:bottom w:type="dxa" w:w="80"/>
+              <w:right w:type="dxa" w:w="120"/>
+            </w:tcMar>
+          </w:tcPr>
+          <w:p>
+            <w:pPr>
+              <w:spacing w:before="20" w:after="20" w:line="240"/>
+            </w:pPr>
+            <w:r>
+              <w:rPr>
+                <w:color w:val="1E293B"/>
+                <w:sz w:val="19"/>
+                <w:szCs w:val="19"/>
+                <w:rFonts w:ascii="Calibri" w:cs="Calibri" w:eastAsia="Calibri" w:hAnsi="Calibri"/>
+              </w:rPr>
+              <w:t xml:space="preserve">School Accounts, Salaries &amp; Staff Tax
+[Operations &amp; Automation]</w:t>
+            </w:r>
+          </w:p>
+        </w:tc>
+        <w:tc>
+          <w:tcPr>
+            <w:tcW w:type="pct" w:w="43%"/>
+            <w:shd w:fill="F8FAFC" w:val="clear"/>
+            <w:tcMar>
+              <w:top w:type="dxa" w:w="80"/>
+              <w:left w:type="dxa" w:w="120"/>
+              <w:bottom w:type="dxa" w:w="80"/>
+              <w:right w:type="dxa" w:w="120"/>
+            </w:tcMar>
+          </w:tcPr>
+          <w:p>
+            <w:pPr>
+              <w:spacing w:before="20" w:after="20" w:line="240"/>
+            </w:pPr>
+            <w:r>
+              <w:rPr>
+                <w:color w:val="1E293B"/>
+                <w:sz w:val="19"/>
+                <w:szCs w:val="19"/>
+                <w:rFonts w:ascii="Calibri" w:cs="Calibri" w:eastAsia="Calibri" w:hAnsi="Calibri"/>
+              </w:rPr>
+              <w:t xml:space="preserve">Pay slip viewer, automated tax liability calculator for UT employees comparing Old vs. New tax regimes.</w:t>
             </w:r>
           </w:p>
         </w:tc>
@@ -5612,7 +5628,7 @@
                 <w:szCs w:val="19"/>
                 <w:rFonts w:ascii="Calibri" w:cs="Calibri" w:eastAsia="Calibri" w:hAnsi="Calibri"/>
               </w:rPr>
-              <w:t xml:space="preserve">Accounts Incharge &amp; Cashier</w:t>
+              <w:t xml:space="preserve">Head Assistant &amp; Accounts Cell</w:t>
             </w:r>
           </w:p>
         </w:tc>
@@ -5646,33 +5662,34 @@
         </w:tc>
         <w:tc>
           <w:tcPr>
-            <w:tcW w:type="pct" w:w="24%"/>
-            <w:shd w:fill="FFFFFF" w:val="clear"/>
-            <w:tcMar>
-              <w:top w:type="dxa" w:w="80"/>
-              <w:left w:type="dxa" w:w="120"/>
-              <w:bottom w:type="dxa" w:w="80"/>
-              <w:right w:type="dxa" w:w="120"/>
-            </w:tcMar>
-          </w:tcPr>
-          <w:p>
-            <w:pPr>
-              <w:spacing w:before="20" w:after="20" w:line="240"/>
-            </w:pPr>
-            <w:r>
-              <w:rPr>
-                <w:color w:val="1E293B"/>
-                <w:sz w:val="19"/>
-                <w:szCs w:val="19"/>
-                <w:rFonts w:ascii="Calibri" w:cs="Calibri" w:eastAsia="Calibri" w:hAnsi="Calibri"/>
-              </w:rPr>
-              <w:t xml:space="preserve">Website CMS &amp; Announcements</w:t>
-            </w:r>
-          </w:p>
-        </w:tc>
-        <w:tc>
-          <w:tcPr>
-            <w:tcW w:type="pct" w:w="46%"/>
+            <w:tcW w:type="pct" w:w="27%"/>
+            <w:shd w:fill="FFFFFF" w:val="clear"/>
+            <w:tcMar>
+              <w:top w:type="dxa" w:w="80"/>
+              <w:left w:type="dxa" w:w="120"/>
+              <w:bottom w:type="dxa" w:w="80"/>
+              <w:right w:type="dxa" w:w="120"/>
+            </w:tcMar>
+          </w:tcPr>
+          <w:p>
+            <w:pPr>
+              <w:spacing w:before="20" w:after="20" w:line="240"/>
+            </w:pPr>
+            <w:r>
+              <w:rPr>
+                <w:color w:val="1E293B"/>
+                <w:sz w:val="19"/>
+                <w:szCs w:val="19"/>
+                <w:rFonts w:ascii="Calibri" w:cs="Calibri" w:eastAsia="Calibri" w:hAnsi="Calibri"/>
+              </w:rPr>
+              <w:t xml:space="preserve">Website CMS &amp; Administration
+[Operations &amp; Automation]</w:t>
+            </w:r>
+          </w:p>
+        </w:tc>
+        <w:tc>
+          <w:tcPr>
+            <w:tcW w:type="pct" w:w="43%"/>
             <w:shd w:fill="FFFFFF" w:val="clear"/>
             <w:tcMar>
               <w:top w:type="dxa" w:w="80"/>
@@ -5752,53 +5769,54 @@
         </w:tc>
         <w:tc>
           <w:tcPr>
-            <w:tcW w:type="pct" w:w="24%"/>
-            <w:shd w:fill="F8FAFC" w:val="clear"/>
-            <w:tcMar>
-              <w:top w:type="dxa" w:w="80"/>
-              <w:left w:type="dxa" w:w="120"/>
-              <w:bottom w:type="dxa" w:w="80"/>
-              <w:right w:type="dxa" w:w="120"/>
-            </w:tcMar>
-          </w:tcPr>
-          <w:p>
-            <w:pPr>
-              <w:spacing w:before="20" w:after="20" w:line="240"/>
-            </w:pPr>
-            <w:r>
-              <w:rPr>
-                <w:color w:val="1E293B"/>
-                <w:sz w:val="19"/>
-                <w:szCs w:val="19"/>
-                <w:rFonts w:ascii="Calibri" w:cs="Calibri" w:eastAsia="Calibri" w:hAnsi="Calibri"/>
-              </w:rPr>
-              <w:t xml:space="preserve">Express Walk-in Admissions</w:t>
-            </w:r>
-          </w:p>
-        </w:tc>
-        <w:tc>
-          <w:tcPr>
-            <w:tcW w:type="pct" w:w="46%"/>
-            <w:shd w:fill="F8FAFC" w:val="clear"/>
-            <w:tcMar>
-              <w:top w:type="dxa" w:w="80"/>
-              <w:left w:type="dxa" w:w="120"/>
-              <w:bottom w:type="dxa" w:w="80"/>
-              <w:right w:type="dxa" w:w="120"/>
-            </w:tcMar>
-          </w:tcPr>
-          <w:p>
-            <w:pPr>
-              <w:spacing w:before="20" w:after="20" w:line="240"/>
-            </w:pPr>
-            <w:r>
-              <w:rPr>
-                <w:color w:val="1E293B"/>
-                <w:sz w:val="19"/>
-                <w:szCs w:val="19"/>
-                <w:rFonts w:ascii="Calibri" w:cs="Calibri" w:eastAsia="Calibri" w:hAnsi="Calibri"/>
-              </w:rPr>
-              <w:t xml:space="preserve">Rapid on-the-spot registration interface for office clerks admitting offline walk-in candidates with receipt.</w:t>
+            <w:tcW w:type="pct" w:w="27%"/>
+            <w:shd w:fill="F8FAFC" w:val="clear"/>
+            <w:tcMar>
+              <w:top w:type="dxa" w:w="80"/>
+              <w:left w:type="dxa" w:w="120"/>
+              <w:bottom w:type="dxa" w:w="80"/>
+              <w:right w:type="dxa" w:w="120"/>
+            </w:tcMar>
+          </w:tcPr>
+          <w:p>
+            <w:pPr>
+              <w:spacing w:before="20" w:after="20" w:line="240"/>
+            </w:pPr>
+            <w:r>
+              <w:rPr>
+                <w:color w:val="1E293B"/>
+                <w:sz w:val="19"/>
+                <w:szCs w:val="19"/>
+                <w:rFonts w:ascii="Calibri" w:cs="Calibri" w:eastAsia="Calibri" w:hAnsi="Calibri"/>
+              </w:rPr>
+              <w:t xml:space="preserve">Board Data Sync (JKBOSE)
+[Operations &amp; Automation]</w:t>
+            </w:r>
+          </w:p>
+        </w:tc>
+        <w:tc>
+          <w:tcPr>
+            <w:tcW w:type="pct" w:w="43%"/>
+            <w:shd w:fill="F8FAFC" w:val="clear"/>
+            <w:tcMar>
+              <w:top w:type="dxa" w:w="80"/>
+              <w:left w:type="dxa" w:w="120"/>
+              <w:bottom w:type="dxa" w:w="80"/>
+              <w:right w:type="dxa" w:w="120"/>
+            </w:tcMar>
+          </w:tcPr>
+          <w:p>
+            <w:pPr>
+              <w:spacing w:before="20" w:after="20" w:line="240"/>
+            </w:pPr>
+            <w:r>
+              <w:rPr>
+                <w:color w:val="1E293B"/>
+                <w:sz w:val="19"/>
+                <w:szCs w:val="19"/>
+                <w:rFonts w:ascii="Calibri" w:cs="Calibri" w:eastAsia="Calibri" w:hAnsi="Calibri"/>
+              </w:rPr>
+              <w:t xml:space="preserve">Matches student records against official board gazettes by Reg Number with 30-day rollback memory.</w:t>
             </w:r>
           </w:p>
         </w:tc>
@@ -5824,7 +5842,7 @@
                 <w:szCs w:val="19"/>
                 <w:rFonts w:ascii="Calibri" w:cs="Calibri" w:eastAsia="Calibri" w:hAnsi="Calibri"/>
               </w:rPr>
-              <w:t xml:space="preserve">Admission Office Clerical Desk</w:t>
+              <w:t xml:space="preserve">Examination Incharge &amp; Records Cell</w:t>
             </w:r>
           </w:p>
         </w:tc>
@@ -5858,53 +5876,54 @@
         </w:tc>
         <w:tc>
           <w:tcPr>
-            <w:tcW w:type="pct" w:w="24%"/>
-            <w:shd w:fill="FFFFFF" w:val="clear"/>
-            <w:tcMar>
-              <w:top w:type="dxa" w:w="80"/>
-              <w:left w:type="dxa" w:w="120"/>
-              <w:bottom w:type="dxa" w:w="80"/>
-              <w:right w:type="dxa" w:w="120"/>
-            </w:tcMar>
-          </w:tcPr>
-          <w:p>
-            <w:pPr>
-              <w:spacing w:before="20" w:after="20" w:line="240"/>
-            </w:pPr>
-            <w:r>
-              <w:rPr>
-                <w:color w:val="1E293B"/>
-                <w:sz w:val="19"/>
-                <w:szCs w:val="19"/>
-                <w:rFonts w:ascii="Calibri" w:cs="Calibri" w:eastAsia="Calibri" w:hAnsi="Calibri"/>
-              </w:rPr>
-              <w:t xml:space="preserve">JKBOSE Gazette Sync Engine</w:t>
-            </w:r>
-          </w:p>
-        </w:tc>
-        <w:tc>
-          <w:tcPr>
-            <w:tcW w:type="pct" w:w="46%"/>
-            <w:shd w:fill="FFFFFF" w:val="clear"/>
-            <w:tcMar>
-              <w:top w:type="dxa" w:w="80"/>
-              <w:left w:type="dxa" w:w="120"/>
-              <w:bottom w:type="dxa" w:w="80"/>
-              <w:right w:type="dxa" w:w="120"/>
-            </w:tcMar>
-          </w:tcPr>
-          <w:p>
-            <w:pPr>
-              <w:spacing w:before="20" w:after="20" w:line="240"/>
-            </w:pPr>
-            <w:r>
-              <w:rPr>
-                <w:color w:val="1E293B"/>
-                <w:sz w:val="19"/>
-                <w:szCs w:val="19"/>
-                <w:rFonts w:ascii="Calibri" w:cs="Calibri" w:eastAsia="Calibri" w:hAnsi="Calibri"/>
-              </w:rPr>
-              <w:t xml:space="preserve">Matches student records against official board gazettes by Reg Number with 30-day rollback memory.</w:t>
+            <w:tcW w:type="pct" w:w="27%"/>
+            <w:shd w:fill="FFFFFF" w:val="clear"/>
+            <w:tcMar>
+              <w:top w:type="dxa" w:w="80"/>
+              <w:left w:type="dxa" w:w="120"/>
+              <w:bottom w:type="dxa" w:w="80"/>
+              <w:right w:type="dxa" w:w="120"/>
+            </w:tcMar>
+          </w:tcPr>
+          <w:p>
+            <w:pPr>
+              <w:spacing w:before="20" w:after="20" w:line="240"/>
+            </w:pPr>
+            <w:r>
+              <w:rPr>
+                <w:color w:val="1E293B"/>
+                <w:sz w:val="19"/>
+                <w:szCs w:val="19"/>
+                <w:rFonts w:ascii="Calibri" w:cs="Calibri" w:eastAsia="Calibri" w:hAnsi="Calibri"/>
+              </w:rPr>
+              <w:t xml:space="preserve">Activity Audit &amp; Dispute Trail
+[Operations &amp; Automation]</w:t>
+            </w:r>
+          </w:p>
+        </w:tc>
+        <w:tc>
+          <w:tcPr>
+            <w:tcW w:type="pct" w:w="43%"/>
+            <w:shd w:fill="FFFFFF" w:val="clear"/>
+            <w:tcMar>
+              <w:top w:type="dxa" w:w="80"/>
+              <w:left w:type="dxa" w:w="120"/>
+              <w:bottom w:type="dxa" w:w="80"/>
+              <w:right w:type="dxa" w:w="120"/>
+            </w:tcMar>
+          </w:tcPr>
+          <w:p>
+            <w:pPr>
+              <w:spacing w:before="20" w:after="20" w:line="240"/>
+            </w:pPr>
+            <w:r>
+              <w:rPr>
+                <w:color w:val="1E293B"/>
+                <w:sz w:val="19"/>
+                <w:szCs w:val="19"/>
+                <w:rFonts w:ascii="Calibri" w:cs="Calibri" w:eastAsia="Calibri" w:hAnsi="Calibri"/>
+              </w:rPr>
+              <w:t xml:space="preserve">Tamper-proof, immutable event logging tracking student, teacher, and administrative mutations for audits.</w:t>
             </w:r>
           </w:p>
         </w:tc>
@@ -5930,7 +5949,7 @@
                 <w:szCs w:val="19"/>
                 <w:rFonts w:ascii="Calibri" w:cs="Calibri" w:eastAsia="Calibri" w:hAnsi="Calibri"/>
               </w:rPr>
-              <w:t xml:space="preserve">Examination Incharge &amp; Records Cell</w:t>
+              <w:t xml:space="preserve">Principal &amp; Institutional Auditor</w:t>
             </w:r>
           </w:p>
         </w:tc>
@@ -5964,53 +5983,54 @@
         </w:tc>
         <w:tc>
           <w:tcPr>
-            <w:tcW w:type="pct" w:w="24%"/>
-            <w:shd w:fill="F8FAFC" w:val="clear"/>
-            <w:tcMar>
-              <w:top w:type="dxa" w:w="80"/>
-              <w:left w:type="dxa" w:w="120"/>
-              <w:bottom w:type="dxa" w:w="80"/>
-              <w:right w:type="dxa" w:w="120"/>
-            </w:tcMar>
-          </w:tcPr>
-          <w:p>
-            <w:pPr>
-              <w:spacing w:before="20" w:after="20" w:line="240"/>
-            </w:pPr>
-            <w:r>
-              <w:rPr>
-                <w:color w:val="1E293B"/>
-                <w:sz w:val="19"/>
-                <w:szCs w:val="19"/>
-                <w:rFonts w:ascii="Calibri" w:cs="Calibri" w:eastAsia="Calibri" w:hAnsi="Calibri"/>
-              </w:rPr>
-              <w:t xml:space="preserve">Role-Based Access Governance</w:t>
-            </w:r>
-          </w:p>
-        </w:tc>
-        <w:tc>
-          <w:tcPr>
-            <w:tcW w:type="pct" w:w="46%"/>
-            <w:shd w:fill="F8FAFC" w:val="clear"/>
-            <w:tcMar>
-              <w:top w:type="dxa" w:w="80"/>
-              <w:left w:type="dxa" w:w="120"/>
-              <w:bottom w:type="dxa" w:w="80"/>
-              <w:right w:type="dxa" w:w="120"/>
-            </w:tcMar>
-          </w:tcPr>
-          <w:p>
-            <w:pPr>
-              <w:spacing w:before="20" w:after="20" w:line="240"/>
-            </w:pPr>
-            <w:r>
-              <w:rPr>
-                <w:color w:val="1E293B"/>
-                <w:sz w:val="19"/>
-                <w:szCs w:val="19"/>
-                <w:rFonts w:ascii="Calibri" w:cs="Calibri" w:eastAsia="Calibri" w:hAnsi="Calibri"/>
-              </w:rPr>
-              <w:t xml:space="preserve">Cryptographic multi-role access control for Principal, Exam Incharge, Accounts Clerk, and Faculty.</w:t>
+            <w:tcW w:type="pct" w:w="27%"/>
+            <w:shd w:fill="F8FAFC" w:val="clear"/>
+            <w:tcMar>
+              <w:top w:type="dxa" w:w="80"/>
+              <w:left w:type="dxa" w:w="120"/>
+              <w:bottom w:type="dxa" w:w="80"/>
+              <w:right w:type="dxa" w:w="120"/>
+            </w:tcMar>
+          </w:tcPr>
+          <w:p>
+            <w:pPr>
+              <w:spacing w:before="20" w:after="20" w:line="240"/>
+            </w:pPr>
+            <w:r>
+              <w:rPr>
+                <w:color w:val="1E293B"/>
+                <w:sz w:val="19"/>
+                <w:szCs w:val="19"/>
+                <w:rFonts w:ascii="Calibri" w:cs="Calibri" w:eastAsia="Calibri" w:hAnsi="Calibri"/>
+              </w:rPr>
+              <w:t xml:space="preserve">Google Contacts Bulk Exporter
+[Operations &amp; Automation]</w:t>
+            </w:r>
+          </w:p>
+        </w:tc>
+        <w:tc>
+          <w:tcPr>
+            <w:tcW w:type="pct" w:w="43%"/>
+            <w:shd w:fill="F8FAFC" w:val="clear"/>
+            <w:tcMar>
+              <w:top w:type="dxa" w:w="80"/>
+              <w:left w:type="dxa" w:w="120"/>
+              <w:bottom w:type="dxa" w:w="80"/>
+              <w:right w:type="dxa" w:w="120"/>
+            </w:tcMar>
+          </w:tcPr>
+          <w:p>
+            <w:pPr>
+              <w:spacing w:before="20" w:after="20" w:line="240"/>
+            </w:pPr>
+            <w:r>
+              <w:rPr>
+                <w:color w:val="1E293B"/>
+                <w:sz w:val="19"/>
+                <w:szCs w:val="19"/>
+                <w:rFonts w:ascii="Calibri" w:cs="Calibri" w:eastAsia="Calibri" w:hAnsi="Calibri"/>
+              </w:rPr>
+              <w:t xml:space="preserve">Cohort export to Google Contacts CSV with standard naming formats, phone categorization &amp; parent details.</w:t>
             </w:r>
           </w:p>
         </w:tc>
@@ -6036,7 +6056,7 @@
                 <w:szCs w:val="19"/>
                 <w:rFonts w:ascii="Calibri" w:cs="Calibri" w:eastAsia="Calibri" w:hAnsi="Calibri"/>
               </w:rPr>
-              <w:t xml:space="preserve">Principal &amp; IT Systems Administrator</w:t>
+              <w:t xml:space="preserve">IT Coordinator &amp; Clerical Cell</w:t>
             </w:r>
           </w:p>
         </w:tc>
@@ -6070,53 +6090,54 @@
         </w:tc>
         <w:tc>
           <w:tcPr>
-            <w:tcW w:type="pct" w:w="24%"/>
-            <w:shd w:fill="FFFFFF" w:val="clear"/>
-            <w:tcMar>
-              <w:top w:type="dxa" w:w="80"/>
-              <w:left w:type="dxa" w:w="120"/>
-              <w:bottom w:type="dxa" w:w="80"/>
-              <w:right w:type="dxa" w:w="120"/>
-            </w:tcMar>
-          </w:tcPr>
-          <w:p>
-            <w:pPr>
-              <w:spacing w:before="20" w:after="20" w:line="240"/>
-            </w:pPr>
-            <w:r>
-              <w:rPr>
-                <w:color w:val="1E293B"/>
-                <w:sz w:val="19"/>
-                <w:szCs w:val="19"/>
-                <w:rFonts w:ascii="Calibri" w:cs="Calibri" w:eastAsia="Calibri" w:hAnsi="Calibri"/>
-              </w:rPr>
-              <w:t xml:space="preserve">Activity Audit &amp; Dispute Trail</w:t>
-            </w:r>
-          </w:p>
-        </w:tc>
-        <w:tc>
-          <w:tcPr>
-            <w:tcW w:type="pct" w:w="46%"/>
-            <w:shd w:fill="FFFFFF" w:val="clear"/>
-            <w:tcMar>
-              <w:top w:type="dxa" w:w="80"/>
-              <w:left w:type="dxa" w:w="120"/>
-              <w:bottom w:type="dxa" w:w="80"/>
-              <w:right w:type="dxa" w:w="120"/>
-            </w:tcMar>
-          </w:tcPr>
-          <w:p>
-            <w:pPr>
-              <w:spacing w:before="20" w:after="20" w:line="240"/>
-            </w:pPr>
-            <w:r>
-              <w:rPr>
-                <w:color w:val="1E293B"/>
-                <w:sz w:val="19"/>
-                <w:szCs w:val="19"/>
-                <w:rFonts w:ascii="Calibri" w:cs="Calibri" w:eastAsia="Calibri" w:hAnsi="Calibri"/>
-              </w:rPr>
-              <w:t xml:space="preserve">Tamper-proof, immutable event logging tracking student, teacher, and administrative mutations for audits.</w:t>
+            <w:tcW w:type="pct" w:w="27%"/>
+            <w:shd w:fill="FFFFFF" w:val="clear"/>
+            <w:tcMar>
+              <w:top w:type="dxa" w:w="80"/>
+              <w:left w:type="dxa" w:w="120"/>
+              <w:bottom w:type="dxa" w:w="80"/>
+              <w:right w:type="dxa" w:w="120"/>
+            </w:tcMar>
+          </w:tcPr>
+          <w:p>
+            <w:pPr>
+              <w:spacing w:before="20" w:after="20" w:line="240"/>
+            </w:pPr>
+            <w:r>
+              <w:rPr>
+                <w:color w:val="1E293B"/>
+                <w:sz w:val="19"/>
+                <w:szCs w:val="19"/>
+                <w:rFonts w:ascii="Calibri" w:cs="Calibri" w:eastAsia="Calibri" w:hAnsi="Calibri"/>
+              </w:rPr>
+              <w:t xml:space="preserve">Staff &amp; Permissions Governance
+[Operations &amp; Automation]</w:t>
+            </w:r>
+          </w:p>
+        </w:tc>
+        <w:tc>
+          <w:tcPr>
+            <w:tcW w:type="pct" w:w="43%"/>
+            <w:shd w:fill="FFFFFF" w:val="clear"/>
+            <w:tcMar>
+              <w:top w:type="dxa" w:w="80"/>
+              <w:left w:type="dxa" w:w="120"/>
+              <w:bottom w:type="dxa" w:w="80"/>
+              <w:right w:type="dxa" w:w="120"/>
+            </w:tcMar>
+          </w:tcPr>
+          <w:p>
+            <w:pPr>
+              <w:spacing w:before="20" w:after="20" w:line="240"/>
+            </w:pPr>
+            <w:r>
+              <w:rPr>
+                <w:color w:val="1E293B"/>
+                <w:sz w:val="19"/>
+                <w:szCs w:val="19"/>
+                <w:rFonts w:ascii="Calibri" w:cs="Calibri" w:eastAsia="Calibri" w:hAnsi="Calibri"/>
+              </w:rPr>
+              <w:t xml:space="preserve">Multi-role access governance (Principal, Exam Incharge, Accounts, Teacher) with fine-grained claim enforcement.</w:t>
             </w:r>
           </w:p>
         </w:tc>
@@ -6142,7 +6163,7 @@
                 <w:szCs w:val="19"/>
                 <w:rFonts w:ascii="Calibri" w:cs="Calibri" w:eastAsia="Calibri" w:hAnsi="Calibri"/>
               </w:rPr>
-              <w:t xml:space="preserve">Principal &amp; Institutional Auditor</w:t>
+              <w:t xml:space="preserve">Principal &amp; IT Systems Administrator</w:t>
             </w:r>
           </w:p>
         </w:tc>
@@ -6176,53 +6197,54 @@
         </w:tc>
         <w:tc>
           <w:tcPr>
-            <w:tcW w:type="pct" w:w="24%"/>
-            <w:shd w:fill="F8FAFC" w:val="clear"/>
-            <w:tcMar>
-              <w:top w:type="dxa" w:w="80"/>
-              <w:left w:type="dxa" w:w="120"/>
-              <w:bottom w:type="dxa" w:w="80"/>
-              <w:right w:type="dxa" w:w="120"/>
-            </w:tcMar>
-          </w:tcPr>
-          <w:p>
-            <w:pPr>
-              <w:spacing w:before="20" w:after="20" w:line="240"/>
-            </w:pPr>
-            <w:r>
-              <w:rPr>
-                <w:color w:val="1E293B"/>
-                <w:sz w:val="19"/>
-                <w:szCs w:val="19"/>
-                <w:rFonts w:ascii="Calibri" w:cs="Calibri" w:eastAsia="Calibri" w:hAnsi="Calibri"/>
-              </w:rPr>
-              <w:t xml:space="preserve">Bulk Ingestion &amp; Batch Overwrite</w:t>
-            </w:r>
-          </w:p>
-        </w:tc>
-        <w:tc>
-          <w:tcPr>
-            <w:tcW w:type="pct" w:w="46%"/>
-            <w:shd w:fill="F8FAFC" w:val="clear"/>
-            <w:tcMar>
-              <w:top w:type="dxa" w:w="80"/>
-              <w:left w:type="dxa" w:w="120"/>
-              <w:bottom w:type="dxa" w:w="80"/>
-              <w:right w:type="dxa" w:w="120"/>
-            </w:tcMar>
-          </w:tcPr>
-          <w:p>
-            <w:pPr>
-              <w:spacing w:before="20" w:after="20" w:line="240"/>
-            </w:pPr>
-            <w:r>
-              <w:rPr>
-                <w:color w:val="1E293B"/>
-                <w:sz w:val="19"/>
-                <w:szCs w:val="19"/>
-                <w:rFonts w:ascii="Calibri" w:cs="Calibri" w:eastAsia="Calibri" w:hAnsi="Calibri"/>
-              </w:rPr>
-              <w:t xml:space="preserve">Batch upload records via Excel/CSV with column mapping, rollback protection, and demographic analytics.</w:t>
+            <w:tcW w:type="pct" w:w="27%"/>
+            <w:shd w:fill="F8FAFC" w:val="clear"/>
+            <w:tcMar>
+              <w:top w:type="dxa" w:w="80"/>
+              <w:left w:type="dxa" w:w="120"/>
+              <w:bottom w:type="dxa" w:w="80"/>
+              <w:right w:type="dxa" w:w="120"/>
+            </w:tcMar>
+          </w:tcPr>
+          <w:p>
+            <w:pPr>
+              <w:spacing w:before="20" w:after="20" w:line="240"/>
+            </w:pPr>
+            <w:r>
+              <w:rPr>
+                <w:color w:val="1E293B"/>
+                <w:sz w:val="19"/>
+                <w:szCs w:val="19"/>
+                <w:rFonts w:ascii="Calibri" w:cs="Calibri" w:eastAsia="Calibri" w:hAnsi="Calibri"/>
+              </w:rPr>
+              <w:t xml:space="preserve">Quick Cell Edit Mode
+[Quick Actions &amp; Ingestion]</w:t>
+            </w:r>
+          </w:p>
+        </w:tc>
+        <w:tc>
+          <w:tcPr>
+            <w:tcW w:type="pct" w:w="43%"/>
+            <w:shd w:fill="F8FAFC" w:val="clear"/>
+            <w:tcMar>
+              <w:top w:type="dxa" w:w="80"/>
+              <w:left w:type="dxa" w:w="120"/>
+              <w:bottom w:type="dxa" w:w="80"/>
+              <w:right w:type="dxa" w:w="120"/>
+            </w:tcMar>
+          </w:tcPr>
+          <w:p>
+            <w:pPr>
+              <w:spacing w:before="20" w:after="20" w:line="240"/>
+            </w:pPr>
+            <w:r>
+              <w:rPr>
+                <w:color w:val="1E293B"/>
+                <w:sz w:val="19"/>
+                <w:szCs w:val="19"/>
+                <w:rFonts w:ascii="Calibri" w:cs="Calibri" w:eastAsia="Calibri" w:hAnsi="Calibri"/>
+              </w:rPr>
+              <w:t xml:space="preserve">Inline cell click-and-edit mode directly modifying tabular student records with immediate auto-audit logs.</w:t>
             </w:r>
           </w:p>
         </w:tc>
@@ -6230,6 +6252,327 @@
           <w:tcPr>
             <w:tcW w:type="pct" w:w="25%"/>
             <w:shd w:fill="F8FAFC" w:val="clear"/>
+            <w:tcMar>
+              <w:top w:type="dxa" w:w="80"/>
+              <w:left w:type="dxa" w:w="120"/>
+              <w:bottom w:type="dxa" w:w="80"/>
+              <w:right w:type="dxa" w:w="120"/>
+            </w:tcMar>
+          </w:tcPr>
+          <w:p>
+            <w:pPr>
+              <w:spacing w:before="20" w:after="20" w:line="240"/>
+            </w:pPr>
+            <w:r>
+              <w:rPr>
+                <w:color w:val="1E293B"/>
+                <w:sz w:val="19"/>
+                <w:szCs w:val="19"/>
+                <w:rFonts w:ascii="Calibri" w:cs="Calibri" w:eastAsia="Calibri" w:hAnsi="Calibri"/>
+              </w:rPr>
+              <w:t xml:space="preserve">Admission Clerical Desk</w:t>
+            </w:r>
+          </w:p>
+        </w:tc>
+      </w:tr>
+      <w:tr>
+        <w:tc>
+          <w:tcPr>
+            <w:tcW w:type="pct" w:w="5%"/>
+            <w:shd w:fill="FFFFFF" w:val="clear"/>
+            <w:tcMar>
+              <w:top w:type="dxa" w:w="80"/>
+              <w:left w:type="dxa" w:w="120"/>
+              <w:bottom w:type="dxa" w:w="80"/>
+              <w:right w:type="dxa" w:w="120"/>
+            </w:tcMar>
+          </w:tcPr>
+          <w:p>
+            <w:pPr>
+              <w:spacing w:before="20" w:after="20" w:line="240"/>
+            </w:pPr>
+            <w:r>
+              <w:rPr>
+                <w:color w:val="1E293B"/>
+                <w:sz w:val="19"/>
+                <w:szCs w:val="19"/>
+                <w:rFonts w:ascii="Calibri" w:cs="Calibri" w:eastAsia="Calibri" w:hAnsi="Calibri"/>
+              </w:rPr>
+              <w:t xml:space="preserve">23</w:t>
+            </w:r>
+          </w:p>
+        </w:tc>
+        <w:tc>
+          <w:tcPr>
+            <w:tcW w:type="pct" w:w="27%"/>
+            <w:shd w:fill="FFFFFF" w:val="clear"/>
+            <w:tcMar>
+              <w:top w:type="dxa" w:w="80"/>
+              <w:left w:type="dxa" w:w="120"/>
+              <w:bottom w:type="dxa" w:w="80"/>
+              <w:right w:type="dxa" w:w="120"/>
+            </w:tcMar>
+          </w:tcPr>
+          <w:p>
+            <w:pPr>
+              <w:spacing w:before="20" w:after="20" w:line="240"/>
+            </w:pPr>
+            <w:r>
+              <w:rPr>
+                <w:color w:val="1E293B"/>
+                <w:sz w:val="19"/>
+                <w:szCs w:val="19"/>
+                <w:rFonts w:ascii="Calibri" w:cs="Calibri" w:eastAsia="Calibri" w:hAnsi="Calibri"/>
+              </w:rPr>
+              <w:t xml:space="preserve">Analytics &amp; Statistical Reports
+[Quick Actions &amp; Ingestion]</w:t>
+            </w:r>
+          </w:p>
+        </w:tc>
+        <w:tc>
+          <w:tcPr>
+            <w:tcW w:type="pct" w:w="43%"/>
+            <w:shd w:fill="FFFFFF" w:val="clear"/>
+            <w:tcMar>
+              <w:top w:type="dxa" w:w="80"/>
+              <w:left w:type="dxa" w:w="120"/>
+              <w:bottom w:type="dxa" w:w="80"/>
+              <w:right w:type="dxa" w:w="120"/>
+            </w:tcMar>
+          </w:tcPr>
+          <w:p>
+            <w:pPr>
+              <w:spacing w:before="20" w:after="20" w:line="240"/>
+            </w:pPr>
+            <w:r>
+              <w:rPr>
+                <w:color w:val="1E293B"/>
+                <w:sz w:val="19"/>
+                <w:szCs w:val="19"/>
+                <w:rFonts w:ascii="Calibri" w:cs="Calibri" w:eastAsia="Calibri" w:hAnsi="Calibri"/>
+              </w:rPr>
+              <w:t xml:space="preserve">Real-time cohort analytics, stream distribution, gender ratios, demographic charts, and enrollment trends.</w:t>
+            </w:r>
+          </w:p>
+        </w:tc>
+        <w:tc>
+          <w:tcPr>
+            <w:tcW w:type="pct" w:w="25%"/>
+            <w:shd w:fill="FFFFFF" w:val="clear"/>
+            <w:tcMar>
+              <w:top w:type="dxa" w:w="80"/>
+              <w:left w:type="dxa" w:w="120"/>
+              <w:bottom w:type="dxa" w:w="80"/>
+              <w:right w:type="dxa" w:w="120"/>
+            </w:tcMar>
+          </w:tcPr>
+          <w:p>
+            <w:pPr>
+              <w:spacing w:before="20" w:after="20" w:line="240"/>
+            </w:pPr>
+            <w:r>
+              <w:rPr>
+                <w:color w:val="1E293B"/>
+                <w:sz w:val="19"/>
+                <w:szCs w:val="19"/>
+                <w:rFonts w:ascii="Calibri" w:cs="Calibri" w:eastAsia="Calibri" w:hAnsi="Calibri"/>
+              </w:rPr>
+              <w:t xml:space="preserve">Principal &amp; Academic Coordinator</w:t>
+            </w:r>
+          </w:p>
+        </w:tc>
+      </w:tr>
+      <w:tr>
+        <w:tc>
+          <w:tcPr>
+            <w:tcW w:type="pct" w:w="5%"/>
+            <w:shd w:fill="F8FAFC" w:val="clear"/>
+            <w:tcMar>
+              <w:top w:type="dxa" w:w="80"/>
+              <w:left w:type="dxa" w:w="120"/>
+              <w:bottom w:type="dxa" w:w="80"/>
+              <w:right w:type="dxa" w:w="120"/>
+            </w:tcMar>
+          </w:tcPr>
+          <w:p>
+            <w:pPr>
+              <w:spacing w:before="20" w:after="20" w:line="240"/>
+            </w:pPr>
+            <w:r>
+              <w:rPr>
+                <w:color w:val="1E293B"/>
+                <w:sz w:val="19"/>
+                <w:szCs w:val="19"/>
+                <w:rFonts w:ascii="Calibri" w:cs="Calibri" w:eastAsia="Calibri" w:hAnsi="Calibri"/>
+              </w:rPr>
+              <w:t xml:space="preserve">24</w:t>
+            </w:r>
+          </w:p>
+        </w:tc>
+        <w:tc>
+          <w:tcPr>
+            <w:tcW w:type="pct" w:w="27%"/>
+            <w:shd w:fill="F8FAFC" w:val="clear"/>
+            <w:tcMar>
+              <w:top w:type="dxa" w:w="80"/>
+              <w:left w:type="dxa" w:w="120"/>
+              <w:bottom w:type="dxa" w:w="80"/>
+              <w:right w:type="dxa" w:w="120"/>
+            </w:tcMar>
+          </w:tcPr>
+          <w:p>
+            <w:pPr>
+              <w:spacing w:before="20" w:after="20" w:line="240"/>
+            </w:pPr>
+            <w:r>
+              <w:rPr>
+                <w:color w:val="1E293B"/>
+                <w:sz w:val="19"/>
+                <w:szCs w:val="19"/>
+                <w:rFonts w:ascii="Calibri" w:cs="Calibri" w:eastAsia="Calibri" w:hAnsi="Calibri"/>
+              </w:rPr>
+              <w:t xml:space="preserve">Express Direct Record Entry
+[Quick Actions &amp; Ingestion]</w:t>
+            </w:r>
+          </w:p>
+        </w:tc>
+        <w:tc>
+          <w:tcPr>
+            <w:tcW w:type="pct" w:w="43%"/>
+            <w:shd w:fill="F8FAFC" w:val="clear"/>
+            <w:tcMar>
+              <w:top w:type="dxa" w:w="80"/>
+              <w:left w:type="dxa" w:w="120"/>
+              <w:bottom w:type="dxa" w:w="80"/>
+              <w:right w:type="dxa" w:w="120"/>
+            </w:tcMar>
+          </w:tcPr>
+          <w:p>
+            <w:pPr>
+              <w:spacing w:before="20" w:after="20" w:line="240"/>
+            </w:pPr>
+            <w:r>
+              <w:rPr>
+                <w:color w:val="1E293B"/>
+                <w:sz w:val="19"/>
+                <w:szCs w:val="19"/>
+                <w:rFonts w:ascii="Calibri" w:cs="Calibri" w:eastAsia="Calibri" w:hAnsi="Calibri"/>
+              </w:rPr>
+              <w:t xml:space="preserve">Rapid on-the-spot registration interface for office clerks admitting offline walk-in candidates with receipt.</w:t>
+            </w:r>
+          </w:p>
+        </w:tc>
+        <w:tc>
+          <w:tcPr>
+            <w:tcW w:type="pct" w:w="25%"/>
+            <w:shd w:fill="F8FAFC" w:val="clear"/>
+            <w:tcMar>
+              <w:top w:type="dxa" w:w="80"/>
+              <w:left w:type="dxa" w:w="120"/>
+              <w:bottom w:type="dxa" w:w="80"/>
+              <w:right w:type="dxa" w:w="120"/>
+            </w:tcMar>
+          </w:tcPr>
+          <w:p>
+            <w:pPr>
+              <w:spacing w:before="20" w:after="20" w:line="240"/>
+            </w:pPr>
+            <w:r>
+              <w:rPr>
+                <w:color w:val="1E293B"/>
+                <w:sz w:val="19"/>
+                <w:szCs w:val="19"/>
+                <w:rFonts w:ascii="Calibri" w:cs="Calibri" w:eastAsia="Calibri" w:hAnsi="Calibri"/>
+              </w:rPr>
+              <w:t xml:space="preserve">Admission Office Clerical Desk</w:t>
+            </w:r>
+          </w:p>
+        </w:tc>
+      </w:tr>
+      <w:tr>
+        <w:tc>
+          <w:tcPr>
+            <w:tcW w:type="pct" w:w="5%"/>
+            <w:shd w:fill="FFFFFF" w:val="clear"/>
+            <w:tcMar>
+              <w:top w:type="dxa" w:w="80"/>
+              <w:left w:type="dxa" w:w="120"/>
+              <w:bottom w:type="dxa" w:w="80"/>
+              <w:right w:type="dxa" w:w="120"/>
+            </w:tcMar>
+          </w:tcPr>
+          <w:p>
+            <w:pPr>
+              <w:spacing w:before="20" w:after="20" w:line="240"/>
+            </w:pPr>
+            <w:r>
+              <w:rPr>
+                <w:color w:val="1E293B"/>
+                <w:sz w:val="19"/>
+                <w:szCs w:val="19"/>
+                <w:rFonts w:ascii="Calibri" w:cs="Calibri" w:eastAsia="Calibri" w:hAnsi="Calibri"/>
+              </w:rPr>
+              <w:t xml:space="preserve">25</w:t>
+            </w:r>
+          </w:p>
+        </w:tc>
+        <w:tc>
+          <w:tcPr>
+            <w:tcW w:type="pct" w:w="27%"/>
+            <w:shd w:fill="FFFFFF" w:val="clear"/>
+            <w:tcMar>
+              <w:top w:type="dxa" w:w="80"/>
+              <w:left w:type="dxa" w:w="120"/>
+              <w:bottom w:type="dxa" w:w="80"/>
+              <w:right w:type="dxa" w:w="120"/>
+            </w:tcMar>
+          </w:tcPr>
+          <w:p>
+            <w:pPr>
+              <w:spacing w:before="20" w:after="20" w:line="240"/>
+            </w:pPr>
+            <w:r>
+              <w:rPr>
+                <w:color w:val="1E293B"/>
+                <w:sz w:val="19"/>
+                <w:szCs w:val="19"/>
+                <w:rFonts w:ascii="Calibri" w:cs="Calibri" w:eastAsia="Calibri" w:hAnsi="Calibri"/>
+              </w:rPr>
+              <w:t xml:space="preserve">Bulk Ingestion &amp; Batch Overwrite
+[Quick Actions &amp; Ingestion]</w:t>
+            </w:r>
+          </w:p>
+        </w:tc>
+        <w:tc>
+          <w:tcPr>
+            <w:tcW w:type="pct" w:w="43%"/>
+            <w:shd w:fill="FFFFFF" w:val="clear"/>
+            <w:tcMar>
+              <w:top w:type="dxa" w:w="80"/>
+              <w:left w:type="dxa" w:w="120"/>
+              <w:bottom w:type="dxa" w:w="80"/>
+              <w:right w:type="dxa" w:w="120"/>
+            </w:tcMar>
+          </w:tcPr>
+          <w:p>
+            <w:pPr>
+              <w:spacing w:before="20" w:after="20" w:line="240"/>
+            </w:pPr>
+            <w:r>
+              <w:rPr>
+                <w:color w:val="1E293B"/>
+                <w:sz w:val="19"/>
+                <w:szCs w:val="19"/>
+                <w:rFonts w:ascii="Calibri" w:cs="Calibri" w:eastAsia="Calibri" w:hAnsi="Calibri"/>
+              </w:rPr>
+              <w:t xml:space="preserve">Batch upload records or overwrite fields via Excel/CSV with column mapping, rollback protection, and analytics.</w:t>
+            </w:r>
+          </w:p>
+        </w:tc>
+        <w:tc>
+          <w:tcPr>
+            <w:tcW w:type="pct" w:w="25%"/>
+            <w:shd w:fill="FFFFFF" w:val="clear"/>
             <w:tcMar>
               <w:top w:type="dxa" w:w="80"/>
               <w:left w:type="dxa" w:w="120"/>
@@ -7000,7 +7343,1329 @@
           <w:szCs w:val="26"/>
           <w:rFonts w:ascii="Calibri" w:cs="Calibri" w:eastAsia="Calibri" w:hAnsi="Calibri"/>
         </w:rPr>
-        <w:t xml:space="preserve">7. Solemn Attestation, Committee Signatures &amp; Executive Sanction</w:t>
+        <w:t xml:space="preserve">7. Schedule C: End-to-End Custom Codebase &amp; Technology Stack Complexity</w:t>
+      </w:r>
+    </w:p>
+    <w:p>
+      <w:pPr>
+        <w:spacing w:before="0" w:after="100"/>
+      </w:pPr>
+      <w:r>
+        <w:rPr>
+          <w:i/>
+          <w:iCs/>
+          <w:color w:val="475569"/>
+          <w:sz w:val="20"/>
+          <w:szCs w:val="20"/>
+          <w:rFonts w:ascii="Calibri" w:cs="Calibri" w:eastAsia="Calibri" w:hAnsi="Calibri"/>
+        </w:rPr>
+        <w:t xml:space="preserve">Technical audit of sovereign codebase scale, lines of code, and multi-tier engineering stack.</w:t>
+      </w:r>
+    </w:p>
+    <w:p>
+      <w:pPr>
+        <w:spacing w:before="40" w:after="80" w:line="260"/>
+        <w:jc w:val="left"/>
+      </w:pPr>
+      <w:r>
+        <w:rPr>
+          <w:b w:val="false"/>
+          <w:bCs w:val="false"/>
+          <w:i w:val="false"/>
+          <w:iCs w:val="false"/>
+          <w:color w:val="1E293B"/>
+          <w:sz w:val="22"/>
+          <w:szCs w:val="22"/>
+          <w:rFonts w:ascii="Calibri" w:cs="Calibri" w:eastAsia="Calibri" w:hAnsi="Calibri"/>
+        </w:rPr>
+        <w:t xml:space="preserve">The Joint Council emphasizes that the GHSS Shangus Digital Platform is 100% custom-code based end-to-end, engineered from the ground up specifically for Govt. Higher Secondary School Shangus. It relies on zero third-party website builders (e.g., WordPress, Wix) or generic commercial templates, guaranteeing absolute institutional software sovereignty, uncompromising performance, and zero vulnerability to vendor lock-in.</w:t>
+      </w:r>
+    </w:p>
+    <w:tbl>
+      <w:tblPr>
+        <w:tblW w:type="pct" w:w="100%"/>
+        <w:tblBorders>
+          <w:top w:val="single" w:color="CBD5E1" w:sz="6"/>
+          <w:left w:val="single" w:color="CBD5E1" w:sz="4"/>
+          <w:bottom w:val="single" w:color="CBD5E1" w:sz="6"/>
+          <w:right w:val="single" w:color="CBD5E1" w:sz="4"/>
+          <w:insideH w:val="single" w:color="E2E8F0" w:sz="4"/>
+          <w:insideV w:val="single" w:color="E2E8F0" w:sz="4"/>
+        </w:tblBorders>
+      </w:tblPr>
+      <w:tblGrid>
+        <w:gridCol w:w="100"/>
+        <w:gridCol w:w="100"/>
+        <w:gridCol w:w="100"/>
+        <w:gridCol w:w="100"/>
+      </w:tblGrid>
+      <w:tr>
+        <w:trPr>
+          <w:tblHeader/>
+        </w:trPr>
+        <w:tc>
+          <w:tcPr>
+            <w:tcW w:type="pct" w:w="26%"/>
+            <w:shd w:fill="1E3A8A" w:val="clear"/>
+            <w:tcMar>
+              <w:top w:type="dxa" w:w="100"/>
+              <w:left w:type="dxa" w:w="120"/>
+              <w:bottom w:type="dxa" w:w="100"/>
+              <w:right w:type="dxa" w:w="120"/>
+            </w:tcMar>
+          </w:tcPr>
+          <w:p>
+            <w:pPr>
+              <w:spacing w:before="0" w:after="0"/>
+              <w:jc w:val="left"/>
+            </w:pPr>
+            <w:r>
+              <w:rPr>
+                <w:b/>
+                <w:bCs/>
+                <w:color w:val="FFFFFF"/>
+                <w:sz w:val="20"/>
+                <w:szCs w:val="20"/>
+                <w:rFonts w:ascii="Calibri" w:cs="Calibri" w:eastAsia="Calibri" w:hAnsi="Calibri"/>
+              </w:rPr>
+              <w:t xml:space="preserve">Software Layer / Subsystem</w:t>
+            </w:r>
+          </w:p>
+        </w:tc>
+        <w:tc>
+          <w:tcPr>
+            <w:tcW w:type="pct" w:w="14%"/>
+            <w:shd w:fill="1E3A8A" w:val="clear"/>
+            <w:tcMar>
+              <w:top w:type="dxa" w:w="100"/>
+              <w:left w:type="dxa" w:w="120"/>
+              <w:bottom w:type="dxa" w:w="100"/>
+              <w:right w:type="dxa" w:w="120"/>
+            </w:tcMar>
+          </w:tcPr>
+          <w:p>
+            <w:pPr>
+              <w:spacing w:before="0" w:after="0"/>
+              <w:jc w:val="left"/>
+            </w:pPr>
+            <w:r>
+              <w:rPr>
+                <w:b/>
+                <w:bCs/>
+                <w:color w:val="FFFFFF"/>
+                <w:sz w:val="20"/>
+                <w:szCs w:val="20"/>
+                <w:rFonts w:ascii="Calibri" w:cs="Calibri" w:eastAsia="Calibri" w:hAnsi="Calibri"/>
+              </w:rPr>
+              <w:t xml:space="preserve">Source Files</w:t>
+            </w:r>
+          </w:p>
+        </w:tc>
+        <w:tc>
+          <w:tcPr>
+            <w:tcW w:type="pct" w:w="20%"/>
+            <w:shd w:fill="1E3A8A" w:val="clear"/>
+            <w:tcMar>
+              <w:top w:type="dxa" w:w="100"/>
+              <w:left w:type="dxa" w:w="120"/>
+              <w:bottom w:type="dxa" w:w="100"/>
+              <w:right w:type="dxa" w:w="120"/>
+            </w:tcMar>
+          </w:tcPr>
+          <w:p>
+            <w:pPr>
+              <w:spacing w:before="0" w:after="0"/>
+              <w:jc w:val="left"/>
+            </w:pPr>
+            <w:r>
+              <w:rPr>
+                <w:b/>
+                <w:bCs/>
+                <w:color w:val="FFFFFF"/>
+                <w:sz w:val="20"/>
+                <w:szCs w:val="20"/>
+                <w:rFonts w:ascii="Calibri" w:cs="Calibri" w:eastAsia="Calibri" w:hAnsi="Calibri"/>
+              </w:rPr>
+              <w:t xml:space="preserve">Volume (Lines of Code)</w:t>
+            </w:r>
+          </w:p>
+        </w:tc>
+        <w:tc>
+          <w:tcPr>
+            <w:tcW w:type="pct" w:w="40%"/>
+            <w:shd w:fill="1E3A8A" w:val="clear"/>
+            <w:tcMar>
+              <w:top w:type="dxa" w:w="100"/>
+              <w:left w:type="dxa" w:w="120"/>
+              <w:bottom w:type="dxa" w:w="100"/>
+              <w:right w:type="dxa" w:w="120"/>
+            </w:tcMar>
+          </w:tcPr>
+          <w:p>
+            <w:pPr>
+              <w:spacing w:before="0" w:after="0"/>
+              <w:jc w:val="left"/>
+            </w:pPr>
+            <w:r>
+              <w:rPr>
+                <w:b/>
+                <w:bCs/>
+                <w:color w:val="FFFFFF"/>
+                <w:sz w:val="20"/>
+                <w:szCs w:val="20"/>
+                <w:rFonts w:ascii="Calibri" w:cs="Calibri" w:eastAsia="Calibri" w:hAnsi="Calibri"/>
+              </w:rPr>
+              <w:t xml:space="preserve">Architectural Complexity &amp; Engineering Role</w:t>
+            </w:r>
+          </w:p>
+        </w:tc>
+      </w:tr>
+      <w:tr>
+        <w:tc>
+          <w:tcPr>
+            <w:tcW w:type="pct" w:w="26%"/>
+            <w:shd w:fill="FFFFFF" w:val="clear"/>
+            <w:tcMar>
+              <w:top w:type="dxa" w:w="80"/>
+              <w:left w:type="dxa" w:w="120"/>
+              <w:bottom w:type="dxa" w:w="80"/>
+              <w:right w:type="dxa" w:w="120"/>
+            </w:tcMar>
+          </w:tcPr>
+          <w:p>
+            <w:pPr>
+              <w:spacing w:before="20" w:after="20" w:line="240"/>
+            </w:pPr>
+            <w:r>
+              <w:rPr>
+                <w:color w:val="1E293B"/>
+                <w:sz w:val="19"/>
+                <w:szCs w:val="19"/>
+                <w:rFonts w:ascii="Calibri" w:cs="Calibri" w:eastAsia="Calibri" w:hAnsi="Calibri"/>
+              </w:rPr>
+              <w:t xml:space="preserve">React 19 JSX UI Components</w:t>
+            </w:r>
+          </w:p>
+        </w:tc>
+        <w:tc>
+          <w:tcPr>
+            <w:tcW w:type="pct" w:w="14%"/>
+            <w:shd w:fill="FFFFFF" w:val="clear"/>
+            <w:tcMar>
+              <w:top w:type="dxa" w:w="80"/>
+              <w:left w:type="dxa" w:w="120"/>
+              <w:bottom w:type="dxa" w:w="80"/>
+              <w:right w:type="dxa" w:w="120"/>
+            </w:tcMar>
+          </w:tcPr>
+          <w:p>
+            <w:pPr>
+              <w:spacing w:before="20" w:after="20" w:line="240"/>
+            </w:pPr>
+            <w:r>
+              <w:rPr>
+                <w:color w:val="1E293B"/>
+                <w:sz w:val="19"/>
+                <w:szCs w:val="19"/>
+                <w:rFonts w:ascii="Calibri" w:cs="Calibri" w:eastAsia="Calibri" w:hAnsi="Calibri"/>
+              </w:rPr>
+              <w:t xml:space="preserve">97 Files</w:t>
+            </w:r>
+          </w:p>
+        </w:tc>
+        <w:tc>
+          <w:tcPr>
+            <w:tcW w:type="pct" w:w="20%"/>
+            <w:shd w:fill="FFFFFF" w:val="clear"/>
+            <w:tcMar>
+              <w:top w:type="dxa" w:w="80"/>
+              <w:left w:type="dxa" w:w="120"/>
+              <w:bottom w:type="dxa" w:w="80"/>
+              <w:right w:type="dxa" w:w="120"/>
+            </w:tcMar>
+          </w:tcPr>
+          <w:p>
+            <w:pPr>
+              <w:spacing w:before="20" w:after="20" w:line="240"/>
+            </w:pPr>
+            <w:r>
+              <w:rPr>
+                <w:color w:val="1E293B"/>
+                <w:sz w:val="19"/>
+                <w:szCs w:val="19"/>
+                <w:rFonts w:ascii="Calibri" w:cs="Calibri" w:eastAsia="Calibri" w:hAnsi="Calibri"/>
+              </w:rPr>
+              <w:t xml:space="preserve">134,838 LOC</w:t>
+            </w:r>
+          </w:p>
+        </w:tc>
+        <w:tc>
+          <w:tcPr>
+            <w:tcW w:type="pct" w:w="40%"/>
+            <w:shd w:fill="FFFFFF" w:val="clear"/>
+            <w:tcMar>
+              <w:top w:type="dxa" w:w="80"/>
+              <w:left w:type="dxa" w:w="120"/>
+              <w:bottom w:type="dxa" w:w="80"/>
+              <w:right w:type="dxa" w:w="120"/>
+            </w:tcMar>
+          </w:tcPr>
+          <w:p>
+            <w:pPr>
+              <w:spacing w:before="20" w:after="20" w:line="240"/>
+            </w:pPr>
+            <w:r>
+              <w:rPr>
+                <w:color w:val="1E293B"/>
+                <w:sz w:val="19"/>
+                <w:szCs w:val="19"/>
+                <w:rFonts w:ascii="Calibri" w:cs="Calibri" w:eastAsia="Calibri" w:hAnsi="Calibri"/>
+              </w:rPr>
+              <w:t xml:space="preserve">Component-based single-page application (SPA); manages 4 autonomous portals, 25 integrated modules, modals, and responsive views.</w:t>
+            </w:r>
+          </w:p>
+        </w:tc>
+      </w:tr>
+      <w:tr>
+        <w:tc>
+          <w:tcPr>
+            <w:tcW w:type="pct" w:w="26%"/>
+            <w:shd w:fill="F8FAFC" w:val="clear"/>
+            <w:tcMar>
+              <w:top w:type="dxa" w:w="80"/>
+              <w:left w:type="dxa" w:w="120"/>
+              <w:bottom w:type="dxa" w:w="80"/>
+              <w:right w:type="dxa" w:w="120"/>
+            </w:tcMar>
+          </w:tcPr>
+          <w:p>
+            <w:pPr>
+              <w:spacing w:before="20" w:after="20" w:line="240"/>
+            </w:pPr>
+            <w:r>
+              <w:rPr>
+                <w:color w:val="1E293B"/>
+                <w:sz w:val="19"/>
+                <w:szCs w:val="19"/>
+                <w:rFonts w:ascii="Calibri" w:cs="Calibri" w:eastAsia="Calibri" w:hAnsi="Calibri"/>
+              </w:rPr>
+              <w:t xml:space="preserve">Core JavaScript Engines &amp; Services</w:t>
+            </w:r>
+          </w:p>
+        </w:tc>
+        <w:tc>
+          <w:tcPr>
+            <w:tcW w:type="pct" w:w="14%"/>
+            <w:shd w:fill="F8FAFC" w:val="clear"/>
+            <w:tcMar>
+              <w:top w:type="dxa" w:w="80"/>
+              <w:left w:type="dxa" w:w="120"/>
+              <w:bottom w:type="dxa" w:w="80"/>
+              <w:right w:type="dxa" w:w="120"/>
+            </w:tcMar>
+          </w:tcPr>
+          <w:p>
+            <w:pPr>
+              <w:spacing w:before="20" w:after="20" w:line="240"/>
+            </w:pPr>
+            <w:r>
+              <w:rPr>
+                <w:color w:val="1E293B"/>
+                <w:sz w:val="19"/>
+                <w:szCs w:val="19"/>
+                <w:rFonts w:ascii="Calibri" w:cs="Calibri" w:eastAsia="Calibri" w:hAnsi="Calibri"/>
+              </w:rPr>
+              <w:t xml:space="preserve">95 Files</w:t>
+            </w:r>
+          </w:p>
+        </w:tc>
+        <w:tc>
+          <w:tcPr>
+            <w:tcW w:type="pct" w:w="20%"/>
+            <w:shd w:fill="F8FAFC" w:val="clear"/>
+            <w:tcMar>
+              <w:top w:type="dxa" w:w="80"/>
+              <w:left w:type="dxa" w:w="120"/>
+              <w:bottom w:type="dxa" w:w="80"/>
+              <w:right w:type="dxa" w:w="120"/>
+            </w:tcMar>
+          </w:tcPr>
+          <w:p>
+            <w:pPr>
+              <w:spacing w:before="20" w:after="20" w:line="240"/>
+            </w:pPr>
+            <w:r>
+              <w:rPr>
+                <w:color w:val="1E293B"/>
+                <w:sz w:val="19"/>
+                <w:szCs w:val="19"/>
+                <w:rFonts w:ascii="Calibri" w:cs="Calibri" w:eastAsia="Calibri" w:hAnsi="Calibri"/>
+              </w:rPr>
+              <w:t xml:space="preserve">55,640 LOC</w:t>
+            </w:r>
+          </w:p>
+        </w:tc>
+        <w:tc>
+          <w:tcPr>
+            <w:tcW w:type="pct" w:w="40%"/>
+            <w:shd w:fill="F8FAFC" w:val="clear"/>
+            <w:tcMar>
+              <w:top w:type="dxa" w:w="80"/>
+              <w:left w:type="dxa" w:w="120"/>
+              <w:bottom w:type="dxa" w:w="80"/>
+              <w:right w:type="dxa" w:w="120"/>
+            </w:tcMar>
+          </w:tcPr>
+          <w:p>
+            <w:pPr>
+              <w:spacing w:before="20" w:after="20" w:line="240"/>
+            </w:pPr>
+            <w:r>
+              <w:rPr>
+                <w:color w:val="1E293B"/>
+                <w:sz w:val="19"/>
+                <w:szCs w:val="19"/>
+                <w:rFonts w:ascii="Calibri" w:cs="Calibri" w:eastAsia="Calibri" w:hAnsi="Calibri"/>
+              </w:rPr>
+              <w:t xml:space="preserve">Vector PDF (jsPDF), Word (.docx), Excel (.xlsx) export engines, business rules, caching algorithms, data synchronization logic.</w:t>
+            </w:r>
+          </w:p>
+        </w:tc>
+      </w:tr>
+      <w:tr>
+        <w:tc>
+          <w:tcPr>
+            <w:tcW w:type="pct" w:w="26%"/>
+            <w:shd w:fill="FFFFFF" w:val="clear"/>
+            <w:tcMar>
+              <w:top w:type="dxa" w:w="80"/>
+              <w:left w:type="dxa" w:w="120"/>
+              <w:bottom w:type="dxa" w:w="80"/>
+              <w:right w:type="dxa" w:w="120"/>
+            </w:tcMar>
+          </w:tcPr>
+          <w:p>
+            <w:pPr>
+              <w:spacing w:before="20" w:after="20" w:line="240"/>
+            </w:pPr>
+            <w:r>
+              <w:rPr>
+                <w:color w:val="1E293B"/>
+                <w:sz w:val="19"/>
+                <w:szCs w:val="19"/>
+                <w:rFonts w:ascii="Calibri" w:cs="Calibri" w:eastAsia="Calibri" w:hAnsi="Calibri"/>
+              </w:rPr>
+              <w:t xml:space="preserve">Automation, Security &amp; Audit Scripts</w:t>
+            </w:r>
+          </w:p>
+        </w:tc>
+        <w:tc>
+          <w:tcPr>
+            <w:tcW w:type="pct" w:w="14%"/>
+            <w:shd w:fill="FFFFFF" w:val="clear"/>
+            <w:tcMar>
+              <w:top w:type="dxa" w:w="80"/>
+              <w:left w:type="dxa" w:w="120"/>
+              <w:bottom w:type="dxa" w:w="80"/>
+              <w:right w:type="dxa" w:w="120"/>
+            </w:tcMar>
+          </w:tcPr>
+          <w:p>
+            <w:pPr>
+              <w:spacing w:before="20" w:after="20" w:line="240"/>
+            </w:pPr>
+            <w:r>
+              <w:rPr>
+                <w:color w:val="1E293B"/>
+                <w:sz w:val="19"/>
+                <w:szCs w:val="19"/>
+                <w:rFonts w:ascii="Calibri" w:cs="Calibri" w:eastAsia="Calibri" w:hAnsi="Calibri"/>
+              </w:rPr>
+              <w:t xml:space="preserve">127 Files</w:t>
+            </w:r>
+          </w:p>
+        </w:tc>
+        <w:tc>
+          <w:tcPr>
+            <w:tcW w:type="pct" w:w="20%"/>
+            <w:shd w:fill="FFFFFF" w:val="clear"/>
+            <w:tcMar>
+              <w:top w:type="dxa" w:w="80"/>
+              <w:left w:type="dxa" w:w="120"/>
+              <w:bottom w:type="dxa" w:w="80"/>
+              <w:right w:type="dxa" w:w="120"/>
+            </w:tcMar>
+          </w:tcPr>
+          <w:p>
+            <w:pPr>
+              <w:spacing w:before="20" w:after="20" w:line="240"/>
+            </w:pPr>
+            <w:r>
+              <w:rPr>
+                <w:color w:val="1E293B"/>
+                <w:sz w:val="19"/>
+                <w:szCs w:val="19"/>
+                <w:rFonts w:ascii="Calibri" w:cs="Calibri" w:eastAsia="Calibri" w:hAnsi="Calibri"/>
+              </w:rPr>
+              <w:t xml:space="preserve">16,446 LOC</w:t>
+            </w:r>
+          </w:p>
+        </w:tc>
+        <w:tc>
+          <w:tcPr>
+            <w:tcW w:type="pct" w:w="40%"/>
+            <w:shd w:fill="FFFFFF" w:val="clear"/>
+            <w:tcMar>
+              <w:top w:type="dxa" w:w="80"/>
+              <w:left w:type="dxa" w:w="120"/>
+              <w:bottom w:type="dxa" w:w="80"/>
+              <w:right w:type="dxa" w:w="120"/>
+            </w:tcMar>
+          </w:tcPr>
+          <w:p>
+            <w:pPr>
+              <w:spacing w:before="20" w:after="20" w:line="240"/>
+            </w:pPr>
+            <w:r>
+              <w:rPr>
+                <w:color w:val="1E293B"/>
+                <w:sz w:val="19"/>
+                <w:szCs w:val="19"/>
+                <w:rFonts w:ascii="Calibri" w:cs="Calibri" w:eastAsia="Calibri" w:hAnsi="Calibri"/>
+              </w:rPr>
+              <w:t xml:space="preserve">Automated regression test suites, Firestore security rules auditors, deduplication, photo downsamplers, integrity validators.</w:t>
+            </w:r>
+          </w:p>
+        </w:tc>
+      </w:tr>
+      <w:tr>
+        <w:tc>
+          <w:tcPr>
+            <w:tcW w:type="pct" w:w="26%"/>
+            <w:shd w:fill="F8FAFC" w:val="clear"/>
+            <w:tcMar>
+              <w:top w:type="dxa" w:w="80"/>
+              <w:left w:type="dxa" w:w="120"/>
+              <w:bottom w:type="dxa" w:w="80"/>
+              <w:right w:type="dxa" w:w="120"/>
+            </w:tcMar>
+          </w:tcPr>
+          <w:p>
+            <w:pPr>
+              <w:spacing w:before="20" w:after="20" w:line="240"/>
+            </w:pPr>
+            <w:r>
+              <w:rPr>
+                <w:color w:val="1E293B"/>
+                <w:sz w:val="19"/>
+                <w:szCs w:val="19"/>
+                <w:rFonts w:ascii="Calibri" w:cs="Calibri" w:eastAsia="Calibri" w:hAnsi="Calibri"/>
+              </w:rPr>
+              <w:t xml:space="preserve">Design System &amp; Responsive Stylesheets</w:t>
+            </w:r>
+          </w:p>
+        </w:tc>
+        <w:tc>
+          <w:tcPr>
+            <w:tcW w:type="pct" w:w="14%"/>
+            <w:shd w:fill="F8FAFC" w:val="clear"/>
+            <w:tcMar>
+              <w:top w:type="dxa" w:w="80"/>
+              <w:left w:type="dxa" w:w="120"/>
+              <w:bottom w:type="dxa" w:w="80"/>
+              <w:right w:type="dxa" w:w="120"/>
+            </w:tcMar>
+          </w:tcPr>
+          <w:p>
+            <w:pPr>
+              <w:spacing w:before="20" w:after="20" w:line="240"/>
+            </w:pPr>
+            <w:r>
+              <w:rPr>
+                <w:color w:val="1E293B"/>
+                <w:sz w:val="19"/>
+                <w:szCs w:val="19"/>
+                <w:rFonts w:ascii="Calibri" w:cs="Calibri" w:eastAsia="Calibri" w:hAnsi="Calibri"/>
+              </w:rPr>
+              <w:t xml:space="preserve">3 Files</w:t>
+            </w:r>
+          </w:p>
+        </w:tc>
+        <w:tc>
+          <w:tcPr>
+            <w:tcW w:type="pct" w:w="20%"/>
+            <w:shd w:fill="F8FAFC" w:val="clear"/>
+            <w:tcMar>
+              <w:top w:type="dxa" w:w="80"/>
+              <w:left w:type="dxa" w:w="120"/>
+              <w:bottom w:type="dxa" w:w="80"/>
+              <w:right w:type="dxa" w:w="120"/>
+            </w:tcMar>
+          </w:tcPr>
+          <w:p>
+            <w:pPr>
+              <w:spacing w:before="20" w:after="20" w:line="240"/>
+            </w:pPr>
+            <w:r>
+              <w:rPr>
+                <w:color w:val="1E293B"/>
+                <w:sz w:val="19"/>
+                <w:szCs w:val="19"/>
+                <w:rFonts w:ascii="Calibri" w:cs="Calibri" w:eastAsia="Calibri" w:hAnsi="Calibri"/>
+              </w:rPr>
+              <w:t xml:space="preserve">3,337 LOC</w:t>
+            </w:r>
+          </w:p>
+        </w:tc>
+        <w:tc>
+          <w:tcPr>
+            <w:tcW w:type="pct" w:w="40%"/>
+            <w:shd w:fill="F8FAFC" w:val="clear"/>
+            <w:tcMar>
+              <w:top w:type="dxa" w:w="80"/>
+              <w:left w:type="dxa" w:w="120"/>
+              <w:bottom w:type="dxa" w:w="80"/>
+              <w:right w:type="dxa" w:w="120"/>
+            </w:tcMar>
+          </w:tcPr>
+          <w:p>
+            <w:pPr>
+              <w:spacing w:before="20" w:after="20" w:line="240"/>
+            </w:pPr>
+            <w:r>
+              <w:rPr>
+                <w:color w:val="1E293B"/>
+                <w:sz w:val="19"/>
+                <w:szCs w:val="19"/>
+                <w:rFonts w:ascii="Calibri" w:cs="Calibri" w:eastAsia="Calibri" w:hAnsi="Calibri"/>
+              </w:rPr>
+              <w:t xml:space="preserve">Modern Vanilla CSS + Tailwind tokens, high-contrast accessibility compliance, adaptive print styling engine (@media print).</w:t>
+            </w:r>
+          </w:p>
+        </w:tc>
+      </w:tr>
+      <w:tr>
+        <w:tc>
+          <w:tcPr>
+            <w:tcW w:type="pct" w:w="26%"/>
+            <w:shd w:fill="FFFFFF" w:val="clear"/>
+            <w:tcMar>
+              <w:top w:type="dxa" w:w="80"/>
+              <w:left w:type="dxa" w:w="120"/>
+              <w:bottom w:type="dxa" w:w="80"/>
+              <w:right w:type="dxa" w:w="120"/>
+            </w:tcMar>
+          </w:tcPr>
+          <w:p>
+            <w:pPr>
+              <w:spacing w:before="20" w:after="20" w:line="240"/>
+            </w:pPr>
+            <w:r>
+              <w:rPr>
+                <w:color w:val="1E293B"/>
+                <w:sz w:val="19"/>
+                <w:szCs w:val="19"/>
+                <w:rFonts w:ascii="Calibri" w:cs="Calibri" w:eastAsia="Calibri" w:hAnsi="Calibri"/>
+              </w:rPr>
+              <w:t xml:space="preserve">TOTAL ENTERPRISE CUSTOM CODEBASE</w:t>
+            </w:r>
+          </w:p>
+        </w:tc>
+        <w:tc>
+          <w:tcPr>
+            <w:tcW w:type="pct" w:w="14%"/>
+            <w:shd w:fill="FFFFFF" w:val="clear"/>
+            <w:tcMar>
+              <w:top w:type="dxa" w:w="80"/>
+              <w:left w:type="dxa" w:w="120"/>
+              <w:bottom w:type="dxa" w:w="80"/>
+              <w:right w:type="dxa" w:w="120"/>
+            </w:tcMar>
+          </w:tcPr>
+          <w:p>
+            <w:pPr>
+              <w:spacing w:before="20" w:after="20" w:line="240"/>
+            </w:pPr>
+            <w:r>
+              <w:rPr>
+                <w:color w:val="1E293B"/>
+                <w:sz w:val="19"/>
+                <w:szCs w:val="19"/>
+                <w:rFonts w:ascii="Calibri" w:cs="Calibri" w:eastAsia="Calibri" w:hAnsi="Calibri"/>
+              </w:rPr>
+              <w:t xml:space="preserve">322 Files</w:t>
+            </w:r>
+          </w:p>
+        </w:tc>
+        <w:tc>
+          <w:tcPr>
+            <w:tcW w:type="pct" w:w="20%"/>
+            <w:shd w:fill="FFFFFF" w:val="clear"/>
+            <w:tcMar>
+              <w:top w:type="dxa" w:w="80"/>
+              <w:left w:type="dxa" w:w="120"/>
+              <w:bottom w:type="dxa" w:w="80"/>
+              <w:right w:type="dxa" w:w="120"/>
+            </w:tcMar>
+          </w:tcPr>
+          <w:p>
+            <w:pPr>
+              <w:spacing w:before="20" w:after="20" w:line="240"/>
+            </w:pPr>
+            <w:r>
+              <w:rPr>
+                <w:color w:val="1E293B"/>
+                <w:sz w:val="19"/>
+                <w:szCs w:val="19"/>
+                <w:rFonts w:ascii="Calibri" w:cs="Calibri" w:eastAsia="Calibri" w:hAnsi="Calibri"/>
+              </w:rPr>
+              <w:t xml:space="preserve">210,261 LOC</w:t>
+            </w:r>
+          </w:p>
+        </w:tc>
+        <w:tc>
+          <w:tcPr>
+            <w:tcW w:type="pct" w:w="40%"/>
+            <w:shd w:fill="FFFFFF" w:val="clear"/>
+            <w:tcMar>
+              <w:top w:type="dxa" w:w="80"/>
+              <w:left w:type="dxa" w:w="120"/>
+              <w:bottom w:type="dxa" w:w="80"/>
+              <w:right w:type="dxa" w:w="120"/>
+            </w:tcMar>
+          </w:tcPr>
+          <w:p>
+            <w:pPr>
+              <w:spacing w:before="20" w:after="20" w:line="240"/>
+            </w:pPr>
+            <w:r>
+              <w:rPr>
+                <w:color w:val="1E293B"/>
+                <w:sz w:val="19"/>
+                <w:szCs w:val="19"/>
+                <w:rFonts w:ascii="Calibri" w:cs="Calibri" w:eastAsia="Calibri" w:hAnsi="Calibri"/>
+              </w:rPr>
+              <w:t xml:space="preserve">Enterprise-grade, sovereign institutional digital infrastructure custom-coded from scratch for GHSS Shangus.</w:t>
+            </w:r>
+          </w:p>
+        </w:tc>
+      </w:tr>
+    </w:tbl>
+    <w:p>
+      <w:pPr>
+        <w:spacing w:before="80" w:after="40"/>
+      </w:pPr>
+    </w:p>
+    <w:tbl>
+      <w:tblPr>
+        <w:tblW w:type="pct" w:w="100%"/>
+        <w:tblBorders>
+          <w:top w:val="single" w:color="CBD5E1" w:sz="6"/>
+          <w:left w:val="single" w:color="CBD5E1" w:sz="4"/>
+          <w:bottom w:val="single" w:color="CBD5E1" w:sz="6"/>
+          <w:right w:val="single" w:color="CBD5E1" w:sz="4"/>
+          <w:insideH w:val="single" w:color="E2E8F0" w:sz="4"/>
+          <w:insideV w:val="single" w:color="E2E8F0" w:sz="4"/>
+        </w:tblBorders>
+      </w:tblPr>
+      <w:tblGrid>
+        <w:gridCol w:w="100"/>
+        <w:gridCol w:w="100"/>
+        <w:gridCol w:w="100"/>
+      </w:tblGrid>
+      <w:tr>
+        <w:trPr>
+          <w:tblHeader/>
+        </w:trPr>
+        <w:tc>
+          <w:tcPr>
+            <w:tcW w:type="pct" w:w="22%"/>
+            <w:shd w:fill="0F3460" w:val="clear"/>
+            <w:tcMar>
+              <w:top w:type="dxa" w:w="100"/>
+              <w:left w:type="dxa" w:w="120"/>
+              <w:bottom w:type="dxa" w:w="100"/>
+              <w:right w:type="dxa" w:w="120"/>
+            </w:tcMar>
+          </w:tcPr>
+          <w:p>
+            <w:pPr>
+              <w:spacing w:before="0" w:after="0"/>
+              <w:jc w:val="left"/>
+            </w:pPr>
+            <w:r>
+              <w:rPr>
+                <w:b/>
+                <w:bCs/>
+                <w:color w:val="FFFFFF"/>
+                <w:sz w:val="20"/>
+                <w:szCs w:val="20"/>
+                <w:rFonts w:ascii="Calibri" w:cs="Calibri" w:eastAsia="Calibri" w:hAnsi="Calibri"/>
+              </w:rPr>
+              <w:t xml:space="preserve">Technology Domain</w:t>
+            </w:r>
+          </w:p>
+        </w:tc>
+        <w:tc>
+          <w:tcPr>
+            <w:tcW w:type="pct" w:w="28%"/>
+            <w:shd w:fill="0F3460" w:val="clear"/>
+            <w:tcMar>
+              <w:top w:type="dxa" w:w="100"/>
+              <w:left w:type="dxa" w:w="120"/>
+              <w:bottom w:type="dxa" w:w="100"/>
+              <w:right w:type="dxa" w:w="120"/>
+            </w:tcMar>
+          </w:tcPr>
+          <w:p>
+            <w:pPr>
+              <w:spacing w:before="0" w:after="0"/>
+              <w:jc w:val="left"/>
+            </w:pPr>
+            <w:r>
+              <w:rPr>
+                <w:b/>
+                <w:bCs/>
+                <w:color w:val="FFFFFF"/>
+                <w:sz w:val="20"/>
+                <w:szCs w:val="20"/>
+                <w:rFonts w:ascii="Calibri" w:cs="Calibri" w:eastAsia="Calibri" w:hAnsi="Calibri"/>
+              </w:rPr>
+              <w:t xml:space="preserve">Engine / Technology</w:t>
+            </w:r>
+          </w:p>
+        </w:tc>
+        <w:tc>
+          <w:tcPr>
+            <w:tcW w:type="pct" w:w="50%"/>
+            <w:shd w:fill="0F3460" w:val="clear"/>
+            <w:tcMar>
+              <w:top w:type="dxa" w:w="100"/>
+              <w:left w:type="dxa" w:w="120"/>
+              <w:bottom w:type="dxa" w:w="100"/>
+              <w:right w:type="dxa" w:w="120"/>
+            </w:tcMar>
+          </w:tcPr>
+          <w:p>
+            <w:pPr>
+              <w:spacing w:before="0" w:after="0"/>
+              <w:jc w:val="left"/>
+            </w:pPr>
+            <w:r>
+              <w:rPr>
+                <w:b/>
+                <w:bCs/>
+                <w:color w:val="FFFFFF"/>
+                <w:sz w:val="20"/>
+                <w:szCs w:val="20"/>
+                <w:rFonts w:ascii="Calibri" w:cs="Calibri" w:eastAsia="Calibri" w:hAnsi="Calibri"/>
+              </w:rPr>
+              <w:t xml:space="preserve">Concrete Implementation &amp; Institutional Value</w:t>
+            </w:r>
+          </w:p>
+        </w:tc>
+      </w:tr>
+      <w:tr>
+        <w:tc>
+          <w:tcPr>
+            <w:tcW w:type="pct" w:w="22%"/>
+            <w:shd w:fill="FFFFFF" w:val="clear"/>
+            <w:tcMar>
+              <w:top w:type="dxa" w:w="80"/>
+              <w:left w:type="dxa" w:w="120"/>
+              <w:bottom w:type="dxa" w:w="80"/>
+              <w:right w:type="dxa" w:w="120"/>
+            </w:tcMar>
+          </w:tcPr>
+          <w:p>
+            <w:pPr>
+              <w:spacing w:before="20" w:after="20" w:line="240"/>
+            </w:pPr>
+            <w:r>
+              <w:rPr>
+                <w:color w:val="1E293B"/>
+                <w:sz w:val="19"/>
+                <w:szCs w:val="19"/>
+                <w:rFonts w:ascii="Calibri" w:cs="Calibri" w:eastAsia="Calibri" w:hAnsi="Calibri"/>
+              </w:rPr>
+              <w:t xml:space="preserve">Frontend Framework</w:t>
+            </w:r>
+          </w:p>
+        </w:tc>
+        <w:tc>
+          <w:tcPr>
+            <w:tcW w:type="pct" w:w="28%"/>
+            <w:shd w:fill="FFFFFF" w:val="clear"/>
+            <w:tcMar>
+              <w:top w:type="dxa" w:w="80"/>
+              <w:left w:type="dxa" w:w="120"/>
+              <w:bottom w:type="dxa" w:w="80"/>
+              <w:right w:type="dxa" w:w="120"/>
+            </w:tcMar>
+          </w:tcPr>
+          <w:p>
+            <w:pPr>
+              <w:spacing w:before="20" w:after="20" w:line="240"/>
+            </w:pPr>
+            <w:r>
+              <w:rPr>
+                <w:color w:val="1E293B"/>
+                <w:sz w:val="19"/>
+                <w:szCs w:val="19"/>
+                <w:rFonts w:ascii="Calibri" w:cs="Calibri" w:eastAsia="Calibri" w:hAnsi="Calibri"/>
+              </w:rPr>
+              <w:t xml:space="preserve">React 19 &amp; React Router v7</w:t>
+            </w:r>
+          </w:p>
+        </w:tc>
+        <w:tc>
+          <w:tcPr>
+            <w:tcW w:type="pct" w:w="50%"/>
+            <w:shd w:fill="FFFFFF" w:val="clear"/>
+            <w:tcMar>
+              <w:top w:type="dxa" w:w="80"/>
+              <w:left w:type="dxa" w:w="120"/>
+              <w:bottom w:type="dxa" w:w="80"/>
+              <w:right w:type="dxa" w:w="120"/>
+            </w:tcMar>
+          </w:tcPr>
+          <w:p>
+            <w:pPr>
+              <w:spacing w:before="20" w:after="20" w:line="240"/>
+            </w:pPr>
+            <w:r>
+              <w:rPr>
+                <w:color w:val="1E293B"/>
+                <w:sz w:val="19"/>
+                <w:szCs w:val="19"/>
+                <w:rFonts w:ascii="Calibri" w:cs="Calibri" w:eastAsia="Calibri" w:hAnsi="Calibri"/>
+              </w:rPr>
+              <w:t xml:space="preserve">Modern SPA architecture with declarative state isolation, code-splitting chunks, dynamic routing, and fast load times.</w:t>
+            </w:r>
+          </w:p>
+        </w:tc>
+      </w:tr>
+      <w:tr>
+        <w:tc>
+          <w:tcPr>
+            <w:tcW w:type="pct" w:w="22%"/>
+            <w:shd w:fill="F8FAFC" w:val="clear"/>
+            <w:tcMar>
+              <w:top w:type="dxa" w:w="80"/>
+              <w:left w:type="dxa" w:w="120"/>
+              <w:bottom w:type="dxa" w:w="80"/>
+              <w:right w:type="dxa" w:w="120"/>
+            </w:tcMar>
+          </w:tcPr>
+          <w:p>
+            <w:pPr>
+              <w:spacing w:before="20" w:after="20" w:line="240"/>
+            </w:pPr>
+            <w:r>
+              <w:rPr>
+                <w:color w:val="1E293B"/>
+                <w:sz w:val="19"/>
+                <w:szCs w:val="19"/>
+                <w:rFonts w:ascii="Calibri" w:cs="Calibri" w:eastAsia="Calibri" w:hAnsi="Calibri"/>
+              </w:rPr>
+              <w:t xml:space="preserve">3D Graphics &amp; Simulation</w:t>
+            </w:r>
+          </w:p>
+        </w:tc>
+        <w:tc>
+          <w:tcPr>
+            <w:tcW w:type="pct" w:w="28%"/>
+            <w:shd w:fill="F8FAFC" w:val="clear"/>
+            <w:tcMar>
+              <w:top w:type="dxa" w:w="80"/>
+              <w:left w:type="dxa" w:w="120"/>
+              <w:bottom w:type="dxa" w:w="80"/>
+              <w:right w:type="dxa" w:w="120"/>
+            </w:tcMar>
+          </w:tcPr>
+          <w:p>
+            <w:pPr>
+              <w:spacing w:before="20" w:after="20" w:line="240"/>
+            </w:pPr>
+            <w:r>
+              <w:rPr>
+                <w:color w:val="1E293B"/>
+                <w:sz w:val="19"/>
+                <w:szCs w:val="19"/>
+                <w:rFonts w:ascii="Calibri" w:cs="Calibri" w:eastAsia="Calibri" w:hAnsi="Calibri"/>
+              </w:rPr>
+              <w:t xml:space="preserve">Three.js (WebGL Engine)</w:t>
+            </w:r>
+          </w:p>
+        </w:tc>
+        <w:tc>
+          <w:tcPr>
+            <w:tcW w:type="pct" w:w="50%"/>
+            <w:shd w:fill="F8FAFC" w:val="clear"/>
+            <w:tcMar>
+              <w:top w:type="dxa" w:w="80"/>
+              <w:left w:type="dxa" w:w="120"/>
+              <w:bottom w:type="dxa" w:w="80"/>
+              <w:right w:type="dxa" w:w="120"/>
+            </w:tcMar>
+          </w:tcPr>
+          <w:p>
+            <w:pPr>
+              <w:spacing w:before="20" w:after="20" w:line="240"/>
+            </w:pPr>
+            <w:r>
+              <w:rPr>
+                <w:color w:val="1E293B"/>
+                <w:sz w:val="19"/>
+                <w:szCs w:val="19"/>
+                <w:rFonts w:ascii="Calibri" w:cs="Calibri" w:eastAsia="Calibri" w:hAnsi="Calibri"/>
+              </w:rPr>
+              <w:t xml:space="preserve">GPU-accelerated Bohr Carbon-12 atomic simulation with 6p+6n nucleus, parametric electron orbits, and central school crest disc.</w:t>
+            </w:r>
+          </w:p>
+        </w:tc>
+      </w:tr>
+      <w:tr>
+        <w:tc>
+          <w:tcPr>
+            <w:tcW w:type="pct" w:w="22%"/>
+            <w:shd w:fill="FFFFFF" w:val="clear"/>
+            <w:tcMar>
+              <w:top w:type="dxa" w:w="80"/>
+              <w:left w:type="dxa" w:w="120"/>
+              <w:bottom w:type="dxa" w:w="80"/>
+              <w:right w:type="dxa" w:w="120"/>
+            </w:tcMar>
+          </w:tcPr>
+          <w:p>
+            <w:pPr>
+              <w:spacing w:before="20" w:after="20" w:line="240"/>
+            </w:pPr>
+            <w:r>
+              <w:rPr>
+                <w:color w:val="1E293B"/>
+                <w:sz w:val="19"/>
+                <w:szCs w:val="19"/>
+                <w:rFonts w:ascii="Calibri" w:cs="Calibri" w:eastAsia="Calibri" w:hAnsi="Calibri"/>
+              </w:rPr>
+              <w:t xml:space="preserve">Cloud Database Architecture</w:t>
+            </w:r>
+          </w:p>
+        </w:tc>
+        <w:tc>
+          <w:tcPr>
+            <w:tcW w:type="pct" w:w="28%"/>
+            <w:shd w:fill="FFFFFF" w:val="clear"/>
+            <w:tcMar>
+              <w:top w:type="dxa" w:w="80"/>
+              <w:left w:type="dxa" w:w="120"/>
+              <w:bottom w:type="dxa" w:w="80"/>
+              <w:right w:type="dxa" w:w="120"/>
+            </w:tcMar>
+          </w:tcPr>
+          <w:p>
+            <w:pPr>
+              <w:spacing w:before="20" w:after="20" w:line="240"/>
+            </w:pPr>
+            <w:r>
+              <w:rPr>
+                <w:color w:val="1E293B"/>
+                <w:sz w:val="19"/>
+                <w:szCs w:val="19"/>
+                <w:rFonts w:ascii="Calibri" w:cs="Calibri" w:eastAsia="Calibri" w:hAnsi="Calibri"/>
+              </w:rPr>
+              <w:t xml:space="preserve">Google Cloud Firestore</w:t>
+            </w:r>
+          </w:p>
+        </w:tc>
+        <w:tc>
+          <w:tcPr>
+            <w:tcW w:type="pct" w:w="50%"/>
+            <w:shd w:fill="FFFFFF" w:val="clear"/>
+            <w:tcMar>
+              <w:top w:type="dxa" w:w="80"/>
+              <w:left w:type="dxa" w:w="120"/>
+              <w:bottom w:type="dxa" w:w="80"/>
+              <w:right w:type="dxa" w:w="120"/>
+            </w:tcMar>
+          </w:tcPr>
+          <w:p>
+            <w:pPr>
+              <w:spacing w:before="20" w:after="20" w:line="240"/>
+            </w:pPr>
+            <w:r>
+              <w:rPr>
+                <w:color w:val="1E293B"/>
+                <w:sz w:val="19"/>
+                <w:szCs w:val="19"/>
+                <w:rFonts w:ascii="Calibri" w:cs="Calibri" w:eastAsia="Calibri" w:hAnsi="Calibri"/>
+              </w:rPr>
+              <w:t xml:space="preserve">Enterprise NoSQL distributed document database, subcollections, compound indexing, real-time snapshot listeners, multi-region replication.</w:t>
+            </w:r>
+          </w:p>
+        </w:tc>
+      </w:tr>
+      <w:tr>
+        <w:tc>
+          <w:tcPr>
+            <w:tcW w:type="pct" w:w="22%"/>
+            <w:shd w:fill="F8FAFC" w:val="clear"/>
+            <w:tcMar>
+              <w:top w:type="dxa" w:w="80"/>
+              <w:left w:type="dxa" w:w="120"/>
+              <w:bottom w:type="dxa" w:w="80"/>
+              <w:right w:type="dxa" w:w="120"/>
+            </w:tcMar>
+          </w:tcPr>
+          <w:p>
+            <w:pPr>
+              <w:spacing w:before="20" w:after="20" w:line="240"/>
+            </w:pPr>
+            <w:r>
+              <w:rPr>
+                <w:color w:val="1E293B"/>
+                <w:sz w:val="19"/>
+                <w:szCs w:val="19"/>
+                <w:rFonts w:ascii="Calibri" w:cs="Calibri" w:eastAsia="Calibri" w:hAnsi="Calibri"/>
+              </w:rPr>
+              <w:t xml:space="preserve">Identity &amp; Access Governance</w:t>
+            </w:r>
+          </w:p>
+        </w:tc>
+        <w:tc>
+          <w:tcPr>
+            <w:tcW w:type="pct" w:w="28%"/>
+            <w:shd w:fill="F8FAFC" w:val="clear"/>
+            <w:tcMar>
+              <w:top w:type="dxa" w:w="80"/>
+              <w:left w:type="dxa" w:w="120"/>
+              <w:bottom w:type="dxa" w:w="80"/>
+              <w:right w:type="dxa" w:w="120"/>
+            </w:tcMar>
+          </w:tcPr>
+          <w:p>
+            <w:pPr>
+              <w:spacing w:before="20" w:after="20" w:line="240"/>
+            </w:pPr>
+            <w:r>
+              <w:rPr>
+                <w:color w:val="1E293B"/>
+                <w:sz w:val="19"/>
+                <w:szCs w:val="19"/>
+                <w:rFonts w:ascii="Calibri" w:cs="Calibri" w:eastAsia="Calibri" w:hAnsi="Calibri"/>
+              </w:rPr>
+              <w:t xml:space="preserve">Firebase Auth + Custom RBAC</w:t>
+            </w:r>
+          </w:p>
+        </w:tc>
+        <w:tc>
+          <w:tcPr>
+            <w:tcW w:type="pct" w:w="50%"/>
+            <w:shd w:fill="F8FAFC" w:val="clear"/>
+            <w:tcMar>
+              <w:top w:type="dxa" w:w="80"/>
+              <w:left w:type="dxa" w:w="120"/>
+              <w:bottom w:type="dxa" w:w="80"/>
+              <w:right w:type="dxa" w:w="120"/>
+            </w:tcMar>
+          </w:tcPr>
+          <w:p>
+            <w:pPr>
+              <w:spacing w:before="20" w:after="20" w:line="240"/>
+            </w:pPr>
+            <w:r>
+              <w:rPr>
+                <w:color w:val="1E293B"/>
+                <w:sz w:val="19"/>
+                <w:szCs w:val="19"/>
+                <w:rFonts w:ascii="Calibri" w:cs="Calibri" w:eastAsia="Calibri" w:hAnsi="Calibri"/>
+              </w:rPr>
+              <w:t xml:space="preserve">Fine-grained Role-Based Access Control, single-faculty isolated session environments, encrypted session tokens.</w:t>
+            </w:r>
+          </w:p>
+        </w:tc>
+      </w:tr>
+      <w:tr>
+        <w:tc>
+          <w:tcPr>
+            <w:tcW w:type="pct" w:w="22%"/>
+            <w:shd w:fill="FFFFFF" w:val="clear"/>
+            <w:tcMar>
+              <w:top w:type="dxa" w:w="80"/>
+              <w:left w:type="dxa" w:w="120"/>
+              <w:bottom w:type="dxa" w:w="80"/>
+              <w:right w:type="dxa" w:w="120"/>
+            </w:tcMar>
+          </w:tcPr>
+          <w:p>
+            <w:pPr>
+              <w:spacing w:before="20" w:after="20" w:line="240"/>
+            </w:pPr>
+            <w:r>
+              <w:rPr>
+                <w:color w:val="1E293B"/>
+                <w:sz w:val="19"/>
+                <w:szCs w:val="19"/>
+                <w:rFonts w:ascii="Calibri" w:cs="Calibri" w:eastAsia="Calibri" w:hAnsi="Calibri"/>
+              </w:rPr>
+              <w:t xml:space="preserve">Client-Side Document Engines</w:t>
+            </w:r>
+          </w:p>
+        </w:tc>
+        <w:tc>
+          <w:tcPr>
+            <w:tcW w:type="pct" w:w="28%"/>
+            <w:shd w:fill="FFFFFF" w:val="clear"/>
+            <w:tcMar>
+              <w:top w:type="dxa" w:w="80"/>
+              <w:left w:type="dxa" w:w="120"/>
+              <w:bottom w:type="dxa" w:w="80"/>
+              <w:right w:type="dxa" w:w="120"/>
+            </w:tcMar>
+          </w:tcPr>
+          <w:p>
+            <w:pPr>
+              <w:spacing w:before="20" w:after="20" w:line="240"/>
+            </w:pPr>
+            <w:r>
+              <w:rPr>
+                <w:color w:val="1E293B"/>
+                <w:sz w:val="19"/>
+                <w:szCs w:val="19"/>
+                <w:rFonts w:ascii="Calibri" w:cs="Calibri" w:eastAsia="Calibri" w:hAnsi="Calibri"/>
+              </w:rPr>
+              <w:t xml:space="preserve">jsPDF, docx, SheetJS (xlsx)</w:t>
+            </w:r>
+          </w:p>
+        </w:tc>
+        <w:tc>
+          <w:tcPr>
+            <w:tcW w:type="pct" w:w="50%"/>
+            <w:shd w:fill="FFFFFF" w:val="clear"/>
+            <w:tcMar>
+              <w:top w:type="dxa" w:w="80"/>
+              <w:left w:type="dxa" w:w="120"/>
+              <w:bottom w:type="dxa" w:w="80"/>
+              <w:right w:type="dxa" w:w="120"/>
+            </w:tcMar>
+          </w:tcPr>
+          <w:p>
+            <w:pPr>
+              <w:spacing w:before="20" w:after="20" w:line="240"/>
+            </w:pPr>
+            <w:r>
+              <w:rPr>
+                <w:color w:val="1E293B"/>
+                <w:sz w:val="19"/>
+                <w:szCs w:val="19"/>
+                <w:rFonts w:ascii="Calibri" w:cs="Calibri" w:eastAsia="Calibri" w:hAnsi="Calibri"/>
+              </w:rPr>
+              <w:t xml:space="preserve">Direct in-browser generation of board-compliant mark cards (PDF), official award rolls (.docx), registers, and Excel reports.</w:t>
+            </w:r>
+          </w:p>
+        </w:tc>
+      </w:tr>
+      <w:tr>
+        <w:tc>
+          <w:tcPr>
+            <w:tcW w:type="pct" w:w="22%"/>
+            <w:shd w:fill="F8FAFC" w:val="clear"/>
+            <w:tcMar>
+              <w:top w:type="dxa" w:w="80"/>
+              <w:left w:type="dxa" w:w="120"/>
+              <w:bottom w:type="dxa" w:w="80"/>
+              <w:right w:type="dxa" w:w="120"/>
+            </w:tcMar>
+          </w:tcPr>
+          <w:p>
+            <w:pPr>
+              <w:spacing w:before="20" w:after="20" w:line="240"/>
+            </w:pPr>
+            <w:r>
+              <w:rPr>
+                <w:color w:val="1E293B"/>
+                <w:sz w:val="19"/>
+                <w:szCs w:val="19"/>
+                <w:rFonts w:ascii="Calibri" w:cs="Calibri" w:eastAsia="Calibri" w:hAnsi="Calibri"/>
+              </w:rPr>
+              <w:t xml:space="preserve">Mobile &amp; Offline Performance</w:t>
+            </w:r>
+          </w:p>
+        </w:tc>
+        <w:tc>
+          <w:tcPr>
+            <w:tcW w:type="pct" w:w="28%"/>
+            <w:shd w:fill="F8FAFC" w:val="clear"/>
+            <w:tcMar>
+              <w:top w:type="dxa" w:w="80"/>
+              <w:left w:type="dxa" w:w="120"/>
+              <w:bottom w:type="dxa" w:w="80"/>
+              <w:right w:type="dxa" w:w="120"/>
+            </w:tcMar>
+          </w:tcPr>
+          <w:p>
+            <w:pPr>
+              <w:spacing w:before="20" w:after="20" w:line="240"/>
+            </w:pPr>
+            <w:r>
+              <w:rPr>
+                <w:color w:val="1E293B"/>
+                <w:sz w:val="19"/>
+                <w:szCs w:val="19"/>
+                <w:rFonts w:ascii="Calibri" w:cs="Calibri" w:eastAsia="Calibri" w:hAnsi="Calibri"/>
+              </w:rPr>
+              <w:t xml:space="preserve">PWA, IndexedDB &amp; Canvas Compression</w:t>
+            </w:r>
+          </w:p>
+        </w:tc>
+        <w:tc>
+          <w:tcPr>
+            <w:tcW w:type="pct" w:w="50%"/>
+            <w:shd w:fill="F8FAFC" w:val="clear"/>
+            <w:tcMar>
+              <w:top w:type="dxa" w:w="80"/>
+              <w:left w:type="dxa" w:w="120"/>
+              <w:bottom w:type="dxa" w:w="80"/>
+              <w:right w:type="dxa" w:w="120"/>
+            </w:tcMar>
+          </w:tcPr>
+          <w:p>
+            <w:pPr>
+              <w:spacing w:before="20" w:after="20" w:line="240"/>
+            </w:pPr>
+            <w:r>
+              <w:rPr>
+                <w:color w:val="1E293B"/>
+                <w:sz w:val="19"/>
+                <w:szCs w:val="19"/>
+                <w:rFonts w:ascii="Calibri" w:cs="Calibri" w:eastAsia="Calibri" w:hAnsi="Calibri"/>
+              </w:rPr>
+              <w:t xml:space="preserve">Two-tier caching (dbCache + IndexedDB) for 2G/3G rural networks; in-browser HTML5 canvas image compression downsampling uploads to &lt;100KB.</w:t>
+            </w:r>
+          </w:p>
+        </w:tc>
+      </w:tr>
+    </w:tbl>
+    <w:p>
+      <w:pPr>
+        <w:spacing w:before="160" w:after="40"/>
+      </w:pPr>
+    </w:p>
+    <w:p>
+      <w:pPr>
+        <w:pStyle w:val="Heading1"/>
+        <w:spacing w:before="200" w:after="60"/>
+      </w:pPr>
+      <w:r>
+        <w:rPr>
+          <w:b/>
+          <w:bCs/>
+          <w:color w:val="0F3460"/>
+          <w:sz w:val="26"/>
+          <w:szCs w:val="26"/>
+          <w:rFonts w:ascii="Calibri" w:cs="Calibri" w:eastAsia="Calibri" w:hAnsi="Calibri"/>
+        </w:rPr>
+        <w:t xml:space="preserve">8. Solemn Attestation, Committee Signatures &amp; Executive Sanction</w:t>
       </w:r>
     </w:p>
     <w:p>

</xml_diff>